<commit_message>
Edited enabling logic for complaint_answer_attachment; added parenting time section to complaint_answer_attachment docx template
</commit_message>
<xml_diff>
--- a/docassemble/MLHDivorceAndCustody/data/templates/complaint_answer_attachment.docx
+++ b/docassemble/MLHDivorceAndCustody/data/templates/complaint_answer_attachment.docx
@@ -4,21 +4,204 @@
   <w:body>
     <w:p>
       <w:pPr>
-        <w:rPr>
-          <w:rFonts w:ascii="Arial" w:hAnsi="Arial" w:cs="Arial"/>
-        </w:rPr>
-      </w:pPr>
-      <w:r>
-        <w:rPr>
-          <w:rFonts w:ascii="Arial" w:hAnsi="Arial" w:cs="Arial"/>
-          <w:b/>
-          <w:bCs/>
+        <w:spacing w:after="0" w:line="240" w:lineRule="auto"/>
+        <w:rPr>
+          <w:rFonts w:ascii="Arial" w:hAnsi="Arial" w:cs="Arial"/>
+        </w:rPr>
+      </w:pPr>
+      <w:r>
+        <w:rPr>
+          <w:rFonts w:ascii="Arial" w:hAnsi="Arial" w:cs="Arial"/>
+        </w:rPr>
+        <w:t xml:space="preserve">{%p if </w:t>
+      </w:r>
+      <w:r>
+        <w:rPr>
+          <w:rFonts w:ascii="Arial" w:hAnsi="Arial" w:cs="Arial"/>
         </w:rPr>
         <w:t>(</w:t>
       </w:r>
       <w:r>
         <w:rPr>
           <w:rFonts w:ascii="Arial" w:hAnsi="Arial" w:cs="Arial"/>
+        </w:rPr>
+        <w:t>PT_type in [“specific”, “supervised”]</w:t>
+      </w:r>
+      <w:r>
+        <w:rPr>
+          <w:rFonts w:ascii="Arial" w:hAnsi="Arial" w:cs="Arial"/>
+        </w:rPr>
+        <w:t>)</w:t>
+      </w:r>
+      <w:r>
+        <w:rPr>
+          <w:rFonts w:ascii="Arial" w:hAnsi="Arial" w:cs="Arial"/>
+        </w:rPr>
+        <w:t xml:space="preserve"> and </w:t>
+      </w:r>
+      <w:r>
+        <w:rPr>
+          <w:rFonts w:ascii="Arial" w:hAnsi="Arial" w:cs="Arial"/>
+        </w:rPr>
+        <w:t>(</w:t>
+      </w:r>
+      <w:r>
+        <w:rPr>
+          <w:rFonts w:ascii="Arial" w:hAnsi="Arial" w:cs="Arial"/>
+        </w:rPr>
+        <w:t>specific_PT_how == “custom”</w:t>
+      </w:r>
+      <w:r>
+        <w:rPr>
+          <w:rFonts w:ascii="Arial" w:hAnsi="Arial" w:cs="Arial"/>
+        </w:rPr>
+        <w:t>)</w:t>
+      </w:r>
+      <w:r>
+        <w:rPr>
+          <w:rFonts w:ascii="Arial" w:hAnsi="Arial" w:cs="Arial"/>
+        </w:rPr>
+        <w:t xml:space="preserve"> %}</w:t>
+      </w:r>
+    </w:p>
+    <w:p>
+      <w:pPr>
+        <w:rPr>
+          <w:rFonts w:ascii="Arial" w:hAnsi="Arial" w:cs="Arial"/>
+          <w:b/>
+          <w:bCs/>
+        </w:rPr>
+      </w:pPr>
+      <w:r>
+        <w:rPr>
+          <w:rFonts w:ascii="Arial" w:hAnsi="Arial" w:cs="Arial"/>
+          <w:b/>
+          <w:bCs/>
+        </w:rPr>
+        <w:t>(</w:t>
+      </w:r>
+      <w:r>
+        <w:rPr>
+          <w:rFonts w:ascii="Arial" w:hAnsi="Arial" w:cs="Arial"/>
+          <w:b/>
+          <w:bCs/>
+        </w:rPr>
+        <w:t>10)</w:t>
+      </w:r>
+      <w:r>
+        <w:rPr>
+          <w:rFonts w:ascii="Arial" w:hAnsi="Arial" w:cs="Arial"/>
+        </w:rPr>
+        <w:t xml:space="preserve"> </w:t>
+      </w:r>
+      <w:r>
+        <w:rPr>
+          <w:rFonts w:ascii="Arial" w:hAnsi="Arial" w:cs="Arial"/>
+          <w:b/>
+          <w:bCs/>
+        </w:rPr>
+        <w:t>Parenting Time:</w:t>
+      </w:r>
+    </w:p>
+    <w:p>
+      <w:pPr>
+        <w:spacing w:after="0" w:line="240" w:lineRule="auto"/>
+        <w:rPr>
+          <w:rFonts w:ascii="Arial" w:hAnsi="Arial" w:cs="Arial"/>
+        </w:rPr>
+      </w:pPr>
+      <w:r>
+        <w:rPr>
+          <w:rFonts w:ascii="Arial" w:hAnsi="Arial" w:cs="Arial"/>
+        </w:rPr>
+        <w:t>{% if PT_type == “supervised” %}</w:t>
+      </w:r>
+      <w:r>
+        <w:rPr>
+          <w:rFonts w:ascii="Arial" w:hAnsi="Arial" w:cs="Arial"/>
+        </w:rPr>
+        <w:t xml:space="preserve">Parenting time will be supervised by </w:t>
+      </w:r>
+      <w:r>
+        <w:rPr>
+          <w:rFonts w:ascii="Arial" w:hAnsi="Arial" w:cs="Arial"/>
+        </w:rPr>
+        <w:t>{{</w:t>
+      </w:r>
+      <w:r>
+        <w:rPr>
+          <w:rFonts w:ascii="Arial" w:hAnsi="Arial" w:cs="Arial"/>
+        </w:rPr>
+        <w:t xml:space="preserve"> PT_supervisor </w:t>
+      </w:r>
+      <w:r>
+        <w:rPr>
+          <w:rFonts w:ascii="Arial" w:hAnsi="Arial" w:cs="Arial"/>
+        </w:rPr>
+        <w:t>}}</w:t>
+      </w:r>
+      <w:r>
+        <w:rPr>
+          <w:rFonts w:ascii="Arial" w:hAnsi="Arial" w:cs="Arial"/>
+        </w:rPr>
+        <w:t xml:space="preserve">. </w:t>
+      </w:r>
+      <w:r>
+        <w:rPr>
+          <w:rFonts w:ascii="Arial" w:hAnsi="Arial" w:cs="Arial"/>
+        </w:rPr>
+        <w:t>{% endif %}</w:t>
+      </w:r>
+      <w:r>
+        <w:rPr>
+          <w:rFonts w:ascii="Arial" w:hAnsi="Arial" w:cs="Arial"/>
+        </w:rPr>
+        <w:t xml:space="preserve">{{ </w:t>
+      </w:r>
+      <w:r>
+        <w:rPr>
+          <w:rFonts w:ascii="Arial" w:hAnsi="Arial" w:cs="Arial"/>
+        </w:rPr>
+        <w:t>custom_PT_details</w:t>
+      </w:r>
+      <w:r>
+        <w:rPr>
+          <w:rFonts w:ascii="Arial" w:hAnsi="Arial" w:cs="Arial"/>
+        </w:rPr>
+        <w:t xml:space="preserve"> }}</w:t>
+      </w:r>
+    </w:p>
+    <w:p>
+      <w:pPr>
+        <w:spacing w:after="0" w:line="240" w:lineRule="auto"/>
+        <w:rPr>
+          <w:rFonts w:ascii="Arial" w:hAnsi="Arial" w:cs="Arial"/>
+        </w:rPr>
+      </w:pPr>
+      <w:r>
+        <w:rPr>
+          <w:rFonts w:ascii="Arial" w:hAnsi="Arial" w:cs="Arial"/>
+        </w:rPr>
+        <w:t>{%p endif %}</w:t>
+      </w:r>
+    </w:p>
+    <w:p>
+      <w:pPr>
+        <w:rPr>
+          <w:rFonts w:ascii="Arial" w:hAnsi="Arial" w:cs="Arial"/>
+        </w:rPr>
+      </w:pPr>
+      <w:r>
+        <w:rPr>
+          <w:rFonts w:ascii="Arial" w:hAnsi="Arial" w:cs="Arial"/>
+          <w:b/>
+          <w:bCs/>
+        </w:rPr>
+        <w:t>(</w:t>
+      </w:r>
+      <w:r>
+        <w:rPr>
+          <w:rFonts w:ascii="Arial" w:hAnsi="Arial" w:cs="Arial"/>
           <w:highlight w:val="yellow"/>
         </w:rPr>
         <w:t xml:space="preserve">{% if </w:t>
@@ -167,14 +350,12 @@
         </w:rPr>
         <w:t xml:space="preserve">{{ </w:t>
       </w:r>
-      <w:proofErr w:type="spellStart"/>
       <w:r>
         <w:rPr>
           <w:rFonts w:ascii="Arial" w:hAnsi="Arial" w:cs="Arial"/>
         </w:rPr>
         <w:t>OP_party_label</w:t>
       </w:r>
-      <w:proofErr w:type="spellEnd"/>
       <w:r>
         <w:rPr>
           <w:rFonts w:ascii="Arial" w:hAnsi="Arial" w:cs="Arial"/>
@@ -216,86 +397,148 @@
           <w:rFonts w:ascii="Arial" w:hAnsi="Arial" w:cs="Arial"/>
           <w:highlight w:val="yellow"/>
         </w:rPr>
-        <w:t xml:space="preserve"> != “” or </w:t>
-      </w:r>
-      <w:proofErr w:type="spellStart"/>
-      <w:r>
-        <w:rPr>
-          <w:rFonts w:ascii="Arial" w:hAnsi="Arial" w:cs="Arial"/>
-          <w:highlight w:val="yellow"/>
+        <w:t xml:space="preserve"> != “” or ss_factor_one_fault != “” %}</w:t>
+      </w:r>
+    </w:p>
+    <w:p>
+      <w:pPr>
+        <w:spacing w:after="0" w:line="240" w:lineRule="auto"/>
+        <w:rPr>
+          <w:rFonts w:ascii="Arial" w:hAnsi="Arial" w:cs="Arial"/>
+        </w:rPr>
+      </w:pPr>
+    </w:p>
+    <w:p>
+      <w:pPr>
+        <w:keepNext/>
+        <w:spacing w:after="0" w:line="240" w:lineRule="auto"/>
+        <w:rPr>
+          <w:rFonts w:ascii="Arial" w:hAnsi="Arial" w:cs="Arial"/>
+          <w:b/>
+          <w:bCs/>
+        </w:rPr>
+      </w:pPr>
+      <w:r>
+        <w:rPr>
+          <w:rFonts w:ascii="Arial" w:hAnsi="Arial" w:cs="Arial"/>
+          <w:b/>
+          <w:bCs/>
+        </w:rPr>
+        <w:t>The past relations and conduct of the parties:</w:t>
+      </w:r>
+    </w:p>
+    <w:p>
+      <w:pPr>
+        <w:keepNext/>
+        <w:spacing w:after="0" w:line="240" w:lineRule="auto"/>
+        <w:rPr>
+          <w:rFonts w:ascii="Arial" w:hAnsi="Arial" w:cs="Arial"/>
+        </w:rPr>
+      </w:pPr>
+      <w:r>
+        <w:rPr>
+          <w:rFonts w:ascii="Arial" w:hAnsi="Arial" w:cs="Arial"/>
+          <w:highlight w:val="cyan"/>
+        </w:rPr>
+        <w:t xml:space="preserve">{%p if </w:t>
+      </w:r>
+      <w:proofErr w:type="spellStart"/>
+      <w:r>
+        <w:rPr>
+          <w:rFonts w:ascii="Arial" w:hAnsi="Arial" w:cs="Arial"/>
+          <w:highlight w:val="cyan"/>
+        </w:rPr>
+        <w:t>ss_factor_one_division_labor</w:t>
+      </w:r>
+      <w:proofErr w:type="spellEnd"/>
+      <w:r>
+        <w:rPr>
+          <w:rFonts w:ascii="Arial" w:hAnsi="Arial" w:cs="Arial"/>
+          <w:highlight w:val="cyan"/>
+        </w:rPr>
+        <w:t xml:space="preserve"> != “” %}</w:t>
+      </w:r>
+    </w:p>
+    <w:p>
+      <w:pPr>
+        <w:spacing w:before="120" w:after="0"/>
+        <w:rPr>
+          <w:rFonts w:ascii="Arial" w:hAnsi="Arial" w:cs="Arial"/>
+        </w:rPr>
+      </w:pPr>
+      <w:r>
+        <w:rPr>
+          <w:rFonts w:ascii="Arial" w:hAnsi="Arial" w:cs="Arial"/>
+        </w:rPr>
+        <w:t xml:space="preserve">Division of work: </w:t>
+      </w:r>
+      <w:r>
+        <w:rPr>
+          <w:rFonts w:ascii="Arial" w:hAnsi="Arial" w:cs="Arial"/>
+        </w:rPr>
+        <w:t xml:space="preserve">{{ </w:t>
+      </w:r>
+      <w:proofErr w:type="spellStart"/>
+      <w:r>
+        <w:rPr>
+          <w:rFonts w:ascii="Arial" w:hAnsi="Arial" w:cs="Arial"/>
+        </w:rPr>
+        <w:t>ss_factor_one_division_labor</w:t>
+      </w:r>
+      <w:proofErr w:type="spellEnd"/>
+      <w:r>
+        <w:rPr>
+          <w:rFonts w:ascii="Arial" w:hAnsi="Arial" w:cs="Arial"/>
+        </w:rPr>
+        <w:t xml:space="preserve"> }}</w:t>
+      </w:r>
+    </w:p>
+    <w:p>
+      <w:pPr>
+        <w:spacing w:after="0" w:line="240" w:lineRule="auto"/>
+        <w:rPr>
+          <w:rFonts w:ascii="Arial" w:hAnsi="Arial" w:cs="Arial"/>
+        </w:rPr>
+      </w:pPr>
+      <w:r>
+        <w:rPr>
+          <w:rFonts w:ascii="Arial" w:hAnsi="Arial" w:cs="Arial"/>
+          <w:highlight w:val="cyan"/>
+        </w:rPr>
+        <w:t>{%p endif %}</w:t>
+      </w:r>
+    </w:p>
+    <w:p>
+      <w:pPr>
+        <w:spacing w:after="0" w:line="240" w:lineRule="auto"/>
+        <w:rPr>
+          <w:rFonts w:ascii="Arial" w:hAnsi="Arial" w:cs="Arial"/>
+        </w:rPr>
+      </w:pPr>
+      <w:r>
+        <w:rPr>
+          <w:rFonts w:ascii="Arial" w:hAnsi="Arial" w:cs="Arial"/>
+          <w:highlight w:val="cyan"/>
+        </w:rPr>
+        <w:t xml:space="preserve">{%p if </w:t>
+      </w:r>
+      <w:r>
+        <w:rPr>
+          <w:rFonts w:ascii="Arial" w:hAnsi="Arial" w:cs="Arial"/>
+          <w:highlight w:val="cyan"/>
         </w:rPr>
         <w:t>ss_factor_one_fault</w:t>
       </w:r>
-      <w:proofErr w:type="spellEnd"/>
-      <w:r>
-        <w:rPr>
-          <w:rFonts w:ascii="Arial" w:hAnsi="Arial" w:cs="Arial"/>
-          <w:highlight w:val="yellow"/>
+      <w:r>
+        <w:rPr>
+          <w:rFonts w:ascii="Arial" w:hAnsi="Arial" w:cs="Arial"/>
+          <w:highlight w:val="cyan"/>
         </w:rPr>
         <w:t xml:space="preserve"> != “” %}</w:t>
       </w:r>
     </w:p>
     <w:p>
       <w:pPr>
-        <w:spacing w:after="0" w:line="240" w:lineRule="auto"/>
-        <w:rPr>
-          <w:rFonts w:ascii="Arial" w:hAnsi="Arial" w:cs="Arial"/>
-        </w:rPr>
-      </w:pPr>
-    </w:p>
-    <w:p>
-      <w:pPr>
-        <w:keepNext/>
-        <w:spacing w:after="0" w:line="240" w:lineRule="auto"/>
-        <w:rPr>
-          <w:rFonts w:ascii="Arial" w:hAnsi="Arial" w:cs="Arial"/>
-          <w:b/>
-          <w:bCs/>
-        </w:rPr>
-      </w:pPr>
-      <w:r>
-        <w:rPr>
-          <w:rFonts w:ascii="Arial" w:hAnsi="Arial" w:cs="Arial"/>
-          <w:b/>
-          <w:bCs/>
-        </w:rPr>
-        <w:t>The past relations and conduct of the parties:</w:t>
-      </w:r>
-    </w:p>
-    <w:p>
-      <w:pPr>
-        <w:keepNext/>
-        <w:spacing w:after="0" w:line="240" w:lineRule="auto"/>
-        <w:rPr>
-          <w:rFonts w:ascii="Arial" w:hAnsi="Arial" w:cs="Arial"/>
-        </w:rPr>
-      </w:pPr>
-      <w:r>
-        <w:rPr>
-          <w:rFonts w:ascii="Arial" w:hAnsi="Arial" w:cs="Arial"/>
-          <w:highlight w:val="cyan"/>
-        </w:rPr>
-        <w:t xml:space="preserve">{%p if </w:t>
-      </w:r>
-      <w:proofErr w:type="spellStart"/>
-      <w:r>
-        <w:rPr>
-          <w:rFonts w:ascii="Arial" w:hAnsi="Arial" w:cs="Arial"/>
-          <w:highlight w:val="cyan"/>
-        </w:rPr>
-        <w:t>ss_factor_one_division_labor</w:t>
-      </w:r>
-      <w:proofErr w:type="spellEnd"/>
-      <w:r>
-        <w:rPr>
-          <w:rFonts w:ascii="Arial" w:hAnsi="Arial" w:cs="Arial"/>
-          <w:highlight w:val="cyan"/>
-        </w:rPr>
-        <w:t xml:space="preserve"> != “” %}</w:t>
-      </w:r>
-    </w:p>
-    <w:p>
-      <w:pPr>
         <w:spacing w:before="120" w:after="0"/>
         <w:rPr>
           <w:rFonts w:ascii="Arial" w:hAnsi="Arial" w:cs="Arial"/>
@@ -305,107 +548,13 @@
         <w:rPr>
           <w:rFonts w:ascii="Arial" w:hAnsi="Arial" w:cs="Arial"/>
         </w:rPr>
-        <w:t xml:space="preserve">Division of work: </w:t>
-      </w:r>
-      <w:r>
-        <w:rPr>
-          <w:rFonts w:ascii="Arial" w:hAnsi="Arial" w:cs="Arial"/>
-        </w:rPr>
-        <w:t xml:space="preserve">{{ </w:t>
-      </w:r>
-      <w:proofErr w:type="spellStart"/>
-      <w:r>
-        <w:rPr>
-          <w:rFonts w:ascii="Arial" w:hAnsi="Arial" w:cs="Arial"/>
-        </w:rPr>
-        <w:t>ss_factor_one_division_labor</w:t>
-      </w:r>
-      <w:proofErr w:type="spellEnd"/>
-      <w:r>
-        <w:rPr>
-          <w:rFonts w:ascii="Arial" w:hAnsi="Arial" w:cs="Arial"/>
-        </w:rPr>
-        <w:t xml:space="preserve"> }}</w:t>
-      </w:r>
-    </w:p>
-    <w:p>
-      <w:pPr>
-        <w:spacing w:after="0" w:line="240" w:lineRule="auto"/>
-        <w:rPr>
-          <w:rFonts w:ascii="Arial" w:hAnsi="Arial" w:cs="Arial"/>
-        </w:rPr>
-      </w:pPr>
-      <w:r>
-        <w:rPr>
-          <w:rFonts w:ascii="Arial" w:hAnsi="Arial" w:cs="Arial"/>
-          <w:highlight w:val="cyan"/>
-        </w:rPr>
-        <w:t>{%p endif %}</w:t>
-      </w:r>
-    </w:p>
-    <w:p>
-      <w:pPr>
-        <w:spacing w:after="0" w:line="240" w:lineRule="auto"/>
-        <w:rPr>
-          <w:rFonts w:ascii="Arial" w:hAnsi="Arial" w:cs="Arial"/>
-        </w:rPr>
-      </w:pPr>
-      <w:r>
-        <w:rPr>
-          <w:rFonts w:ascii="Arial" w:hAnsi="Arial" w:cs="Arial"/>
-          <w:highlight w:val="cyan"/>
-        </w:rPr>
-        <w:t xml:space="preserve">{%p if </w:t>
-      </w:r>
-      <w:proofErr w:type="spellStart"/>
-      <w:r>
-        <w:rPr>
-          <w:rFonts w:ascii="Arial" w:hAnsi="Arial" w:cs="Arial"/>
-          <w:highlight w:val="cyan"/>
-        </w:rPr>
-        <w:t>ss_factor_one_fault</w:t>
-      </w:r>
-      <w:proofErr w:type="spellEnd"/>
-      <w:r>
-        <w:rPr>
-          <w:rFonts w:ascii="Arial" w:hAnsi="Arial" w:cs="Arial"/>
-          <w:highlight w:val="cyan"/>
-        </w:rPr>
-        <w:t xml:space="preserve"> != “” %}</w:t>
-      </w:r>
-    </w:p>
-    <w:p>
-      <w:pPr>
-        <w:spacing w:before="120" w:after="0"/>
-        <w:rPr>
-          <w:rFonts w:ascii="Arial" w:hAnsi="Arial" w:cs="Arial"/>
-        </w:rPr>
-      </w:pPr>
-      <w:r>
-        <w:rPr>
-          <w:rFonts w:ascii="Arial" w:hAnsi="Arial" w:cs="Arial"/>
-        </w:rPr>
         <w:t xml:space="preserve">Fault: </w:t>
       </w:r>
       <w:r>
         <w:rPr>
           <w:rFonts w:ascii="Arial" w:hAnsi="Arial" w:cs="Arial"/>
         </w:rPr>
-        <w:t xml:space="preserve">{{ </w:t>
-      </w:r>
-      <w:proofErr w:type="spellStart"/>
-      <w:r>
-        <w:rPr>
-          <w:rFonts w:ascii="Arial" w:hAnsi="Arial" w:cs="Arial"/>
-        </w:rPr>
-        <w:t>ss_factor_one_fault</w:t>
-      </w:r>
-      <w:proofErr w:type="spellEnd"/>
-      <w:r>
-        <w:rPr>
-          <w:rFonts w:ascii="Arial" w:hAnsi="Arial" w:cs="Arial"/>
-        </w:rPr>
-        <w:t xml:space="preserve"> }}</w:t>
+        <w:t>{{ ss_factor_one_fault }}</w:t>
       </w:r>
     </w:p>
     <w:p>
@@ -764,21 +913,7 @@
         <w:rPr>
           <w:rFonts w:ascii="Arial" w:hAnsi="Arial" w:cs="Arial"/>
         </w:rPr>
-        <w:t>{{ capitalize(</w:t>
-      </w:r>
-      <w:proofErr w:type="spellStart"/>
-      <w:r>
-        <w:rPr>
-          <w:rFonts w:ascii="Arial" w:hAnsi="Arial" w:cs="Arial"/>
-        </w:rPr>
-        <w:t>OP_party_label</w:t>
-      </w:r>
-      <w:proofErr w:type="spellEnd"/>
-      <w:r>
-        <w:rPr>
-          <w:rFonts w:ascii="Arial" w:hAnsi="Arial" w:cs="Arial"/>
-        </w:rPr>
-        <w:t>) }}</w:t>
+        <w:t>{{ capitalize(OP_party_label) }}</w:t>
       </w:r>
       <w:r>
         <w:rPr>
@@ -917,6 +1052,7 @@
         <w:rPr>
           <w:rFonts w:ascii="Arial" w:hAnsi="Arial" w:cs="Arial"/>
         </w:rPr>
+        <w:lastRenderedPageBreak/>
         <w:t xml:space="preserve">{{ </w:t>
       </w:r>
       <w:proofErr w:type="spellStart"/>
@@ -1041,7 +1177,6 @@
         </w:rPr>
         <w:t>capitalize(</w:t>
       </w:r>
-      <w:proofErr w:type="spellStart"/>
       <w:r>
         <w:rPr>
           <w:rFonts w:ascii="Arial" w:hAnsi="Arial" w:cs="Arial"/>
@@ -1050,7 +1185,6 @@
         </w:rPr>
         <w:t>OP_party_label</w:t>
       </w:r>
-      <w:proofErr w:type="spellEnd"/>
       <w:r>
         <w:rPr>
           <w:rFonts w:ascii="Arial" w:hAnsi="Arial" w:cs="Arial"/>
@@ -1131,7 +1265,6 @@
           <w:rFonts w:ascii="Arial" w:hAnsi="Arial" w:cs="Arial"/>
           <w:highlight w:val="yellow"/>
         </w:rPr>
-        <w:lastRenderedPageBreak/>
         <w:t xml:space="preserve">{%p if </w:t>
       </w:r>
       <w:proofErr w:type="spellStart"/>
@@ -1960,6 +2093,7 @@
           <w:b/>
           <w:bCs/>
         </w:rPr>
+        <w:lastRenderedPageBreak/>
         <w:t>The effect of cohabitation on a party’s financial status:</w:t>
       </w:r>
     </w:p>
@@ -2061,7 +2195,6 @@
           <w:b/>
           <w:bCs/>
         </w:rPr>
-        <w:lastRenderedPageBreak/>
         <w:t>General principles of equity:</w:t>
       </w:r>
     </w:p>
@@ -2236,36 +2369,8 @@
         <w:sz w:val="20"/>
         <w:szCs w:val="20"/>
       </w:rPr>
-      <w:t xml:space="preserve"> {% if </w:t>
+      <w:t xml:space="preserve"> {% if tool_ID == “divorce_complaint</w:t>
     </w:r>
-    <w:proofErr w:type="spellStart"/>
-    <w:r>
-      <w:rPr>
-        <w:rFonts w:ascii="Arial" w:hAnsi="Arial" w:cs="Arial"/>
-        <w:sz w:val="20"/>
-        <w:szCs w:val="20"/>
-      </w:rPr>
-      <w:t>tool_ID</w:t>
-    </w:r>
-    <w:proofErr w:type="spellEnd"/>
-    <w:r>
-      <w:rPr>
-        <w:rFonts w:ascii="Arial" w:hAnsi="Arial" w:cs="Arial"/>
-        <w:sz w:val="20"/>
-        <w:szCs w:val="20"/>
-      </w:rPr>
-      <w:t xml:space="preserve"> == “</w:t>
-    </w:r>
-    <w:proofErr w:type="spellStart"/>
-    <w:r>
-      <w:rPr>
-        <w:rFonts w:ascii="Arial" w:hAnsi="Arial" w:cs="Arial"/>
-        <w:sz w:val="20"/>
-        <w:szCs w:val="20"/>
-      </w:rPr>
-      <w:t>divorce_complaint</w:t>
-    </w:r>
-    <w:proofErr w:type="spellEnd"/>
     <w:r>
       <w:rPr>
         <w:rFonts w:ascii="Arial" w:hAnsi="Arial" w:cs="Arial"/>
@@ -2296,61 +2401,7 @@
         <w:sz w:val="20"/>
         <w:szCs w:val="20"/>
       </w:rPr>
-      <w:t xml:space="preserve">{% </w:t>
-    </w:r>
-    <w:proofErr w:type="spellStart"/>
-    <w:r>
-      <w:rPr>
-        <w:rFonts w:ascii="Arial" w:hAnsi="Arial" w:cs="Arial"/>
-        <w:sz w:val="20"/>
-        <w:szCs w:val="20"/>
-      </w:rPr>
-      <w:t>elif</w:t>
-    </w:r>
-    <w:proofErr w:type="spellEnd"/>
-    <w:r>
-      <w:rPr>
-        <w:rFonts w:ascii="Arial" w:hAnsi="Arial" w:cs="Arial"/>
-        <w:sz w:val="20"/>
-        <w:szCs w:val="20"/>
-      </w:rPr>
-      <w:t xml:space="preserve"> </w:t>
-    </w:r>
-    <w:proofErr w:type="spellStart"/>
-    <w:r>
-      <w:rPr>
-        <w:rFonts w:ascii="Arial" w:hAnsi="Arial" w:cs="Arial"/>
-        <w:sz w:val="20"/>
-        <w:szCs w:val="20"/>
-      </w:rPr>
-      <w:t>tool_ID</w:t>
-    </w:r>
-    <w:proofErr w:type="spellEnd"/>
-    <w:r>
-      <w:rPr>
-        <w:rFonts w:ascii="Arial" w:hAnsi="Arial" w:cs="Arial"/>
-        <w:sz w:val="20"/>
-        <w:szCs w:val="20"/>
-      </w:rPr>
-      <w:t xml:space="preserve"> == “</w:t>
-    </w:r>
-    <w:proofErr w:type="spellStart"/>
-    <w:r>
-      <w:rPr>
-        <w:rFonts w:ascii="Arial" w:hAnsi="Arial" w:cs="Arial"/>
-        <w:sz w:val="20"/>
-        <w:szCs w:val="20"/>
-      </w:rPr>
-      <w:t>divorce_answer</w:t>
-    </w:r>
-    <w:proofErr w:type="spellEnd"/>
-    <w:r>
-      <w:rPr>
-        <w:rFonts w:ascii="Arial" w:hAnsi="Arial" w:cs="Arial"/>
-        <w:sz w:val="20"/>
-        <w:szCs w:val="20"/>
-      </w:rPr>
-      <w:t>” %}</w:t>
+      <w:t>{% elif tool_ID == “divorce_answer” %}</w:t>
     </w:r>
     <w:r>
       <w:rPr>
@@ -2520,36 +2571,8 @@
         <w:sz w:val="20"/>
         <w:szCs w:val="20"/>
       </w:rPr>
-      <w:t xml:space="preserve"> {% if </w:t>
+      <w:t xml:space="preserve"> {% if tool_ID == “divorce_complaint</w:t>
     </w:r>
-    <w:proofErr w:type="spellStart"/>
-    <w:r>
-      <w:rPr>
-        <w:rFonts w:ascii="Arial" w:hAnsi="Arial" w:cs="Arial"/>
-        <w:sz w:val="20"/>
-        <w:szCs w:val="20"/>
-      </w:rPr>
-      <w:t>tool_ID</w:t>
-    </w:r>
-    <w:proofErr w:type="spellEnd"/>
-    <w:r>
-      <w:rPr>
-        <w:rFonts w:ascii="Arial" w:hAnsi="Arial" w:cs="Arial"/>
-        <w:sz w:val="20"/>
-        <w:szCs w:val="20"/>
-      </w:rPr>
-      <w:t xml:space="preserve"> == “</w:t>
-    </w:r>
-    <w:proofErr w:type="spellStart"/>
-    <w:r>
-      <w:rPr>
-        <w:rFonts w:ascii="Arial" w:hAnsi="Arial" w:cs="Arial"/>
-        <w:sz w:val="20"/>
-        <w:szCs w:val="20"/>
-      </w:rPr>
-      <w:t>divorce_complaint</w:t>
-    </w:r>
-    <w:proofErr w:type="spellEnd"/>
     <w:r>
       <w:rPr>
         <w:rFonts w:ascii="Arial" w:hAnsi="Arial" w:cs="Arial"/>
@@ -2580,61 +2603,7 @@
         <w:sz w:val="20"/>
         <w:szCs w:val="20"/>
       </w:rPr>
-      <w:t xml:space="preserve">{% </w:t>
-    </w:r>
-    <w:proofErr w:type="spellStart"/>
-    <w:r>
-      <w:rPr>
-        <w:rFonts w:ascii="Arial" w:hAnsi="Arial" w:cs="Arial"/>
-        <w:sz w:val="20"/>
-        <w:szCs w:val="20"/>
-      </w:rPr>
-      <w:t>elif</w:t>
-    </w:r>
-    <w:proofErr w:type="spellEnd"/>
-    <w:r>
-      <w:rPr>
-        <w:rFonts w:ascii="Arial" w:hAnsi="Arial" w:cs="Arial"/>
-        <w:sz w:val="20"/>
-        <w:szCs w:val="20"/>
-      </w:rPr>
-      <w:t xml:space="preserve"> </w:t>
-    </w:r>
-    <w:proofErr w:type="spellStart"/>
-    <w:r>
-      <w:rPr>
-        <w:rFonts w:ascii="Arial" w:hAnsi="Arial" w:cs="Arial"/>
-        <w:sz w:val="20"/>
-        <w:szCs w:val="20"/>
-      </w:rPr>
-      <w:t>tool_ID</w:t>
-    </w:r>
-    <w:proofErr w:type="spellEnd"/>
-    <w:r>
-      <w:rPr>
-        <w:rFonts w:ascii="Arial" w:hAnsi="Arial" w:cs="Arial"/>
-        <w:sz w:val="20"/>
-        <w:szCs w:val="20"/>
-      </w:rPr>
-      <w:t xml:space="preserve"> == “</w:t>
-    </w:r>
-    <w:proofErr w:type="spellStart"/>
-    <w:r>
-      <w:rPr>
-        <w:rFonts w:ascii="Arial" w:hAnsi="Arial" w:cs="Arial"/>
-        <w:sz w:val="20"/>
-        <w:szCs w:val="20"/>
-      </w:rPr>
-      <w:t>divorce_answer</w:t>
-    </w:r>
-    <w:proofErr w:type="spellEnd"/>
-    <w:r>
-      <w:rPr>
-        <w:rFonts w:ascii="Arial" w:hAnsi="Arial" w:cs="Arial"/>
-        <w:sz w:val="20"/>
-        <w:szCs w:val="20"/>
-      </w:rPr>
-      <w:t>” %}A</w:t>
+      <w:t>{% elif tool_ID == “divorce_answer” %}A</w:t>
     </w:r>
     <w:r>
       <w:rPr>
@@ -2970,39 +2939,7 @@
               <w:sz w:val="20"/>
               <w:szCs w:val="20"/>
             </w:rPr>
-            <w:t xml:space="preserve">{% if </w:t>
-          </w:r>
-          <w:proofErr w:type="spellStart"/>
-          <w:r>
-            <w:rPr>
-              <w:sz w:val="20"/>
-              <w:szCs w:val="20"/>
-            </w:rPr>
-            <w:t>tool_ID</w:t>
-          </w:r>
-          <w:proofErr w:type="spellEnd"/>
-          <w:r>
-            <w:rPr>
-              <w:sz w:val="20"/>
-              <w:szCs w:val="20"/>
-            </w:rPr>
-            <w:t xml:space="preserve"> == “</w:t>
-          </w:r>
-          <w:proofErr w:type="spellStart"/>
-          <w:r>
-            <w:rPr>
-              <w:sz w:val="20"/>
-              <w:szCs w:val="20"/>
-            </w:rPr>
-            <w:t>divorce_complaint</w:t>
-          </w:r>
-          <w:proofErr w:type="spellEnd"/>
-          <w:r>
-            <w:rPr>
-              <w:sz w:val="20"/>
-              <w:szCs w:val="20"/>
-            </w:rPr>
-            <w:t>” %}</w:t>
+            <w:t>{% if tool_ID == “divorce_complaint” %}</w:t>
           </w:r>
           <w:r>
             <w:rPr>
@@ -3018,55 +2955,7 @@
               <w:sz w:val="20"/>
               <w:szCs w:val="20"/>
             </w:rPr>
-            <w:t xml:space="preserve">{% </w:t>
-          </w:r>
-          <w:proofErr w:type="spellStart"/>
-          <w:r>
-            <w:rPr>
-              <w:sz w:val="20"/>
-              <w:szCs w:val="20"/>
-            </w:rPr>
-            <w:t>elif</w:t>
-          </w:r>
-          <w:proofErr w:type="spellEnd"/>
-          <w:r>
-            <w:rPr>
-              <w:sz w:val="20"/>
-              <w:szCs w:val="20"/>
-            </w:rPr>
-            <w:t xml:space="preserve"> </w:t>
-          </w:r>
-          <w:proofErr w:type="spellStart"/>
-          <w:r>
-            <w:rPr>
-              <w:sz w:val="20"/>
-              <w:szCs w:val="20"/>
-            </w:rPr>
-            <w:t>tool_ID</w:t>
-          </w:r>
-          <w:proofErr w:type="spellEnd"/>
-          <w:r>
-            <w:rPr>
-              <w:sz w:val="20"/>
-              <w:szCs w:val="20"/>
-            </w:rPr>
-            <w:t xml:space="preserve"> == “</w:t>
-          </w:r>
-          <w:proofErr w:type="spellStart"/>
-          <w:r>
-            <w:rPr>
-              <w:sz w:val="20"/>
-              <w:szCs w:val="20"/>
-            </w:rPr>
-            <w:t>divorce_answer</w:t>
-          </w:r>
-          <w:proofErr w:type="spellEnd"/>
-          <w:r>
-            <w:rPr>
-              <w:sz w:val="20"/>
-              <w:szCs w:val="20"/>
-            </w:rPr>
-            <w:t>” %}</w:t>
+            <w:t>{% elif tool_ID == “divorce_answer” %}</w:t>
           </w:r>
           <w:r>
             <w:rPr>

</xml_diff>

<commit_message>
Added space in attachment docx template
</commit_message>
<xml_diff>
--- a/docassemble/MLHDivorceAndCustody/data/templates/complaint_answer_attachment.docx
+++ b/docassemble/MLHDivorceAndCustody/data/templates/complaint_answer_attachment.docx
@@ -170,6 +170,14 @@
         </w:rPr>
         <w:t xml:space="preserve"> }}</w:t>
       </w:r>
+    </w:p>
+    <w:p>
+      <w:pPr>
+        <w:spacing w:after="0" w:line="240" w:lineRule="auto"/>
+        <w:rPr>
+          <w:rFonts w:ascii="Arial" w:hAnsi="Arial" w:cs="Arial"/>
+        </w:rPr>
+      </w:pPr>
     </w:p>
     <w:p>
       <w:pPr>

</xml_diff>

<commit_message>
logic edits; formatting edits; clean up unneeded code
</commit_message>
<xml_diff>
--- a/docassemble/MLHDivorceAndCustody/data/templates/complaint_answer_attachment.docx
+++ b/docassemble/MLHDivorceAndCustody/data/templates/complaint_answer_attachment.docx
@@ -190,15 +190,52 @@
         <w:rPr>
           <w:rFonts w:ascii="Arial" w:hAnsi="Arial" w:cs="Arial"/>
         </w:rPr>
-        <w:t>{%p endif %}</w:t>
-      </w:r>
-    </w:p>
-    <w:p>
-      <w:pPr>
-        <w:rPr>
-          <w:rFonts w:ascii="Arial" w:hAnsi="Arial" w:cs="Arial"/>
-        </w:rPr>
-      </w:pPr>
+        <w:t xml:space="preserve">{%p </w:t>
+      </w:r>
+      <w:proofErr w:type="gramStart"/>
+      <w:r>
+        <w:rPr>
+          <w:rFonts w:ascii="Arial" w:hAnsi="Arial" w:cs="Arial"/>
+        </w:rPr>
+        <w:t>endif %}</w:t>
+      </w:r>
+      <w:proofErr w:type="gramEnd"/>
+    </w:p>
+    <w:p>
+      <w:pPr>
+        <w:spacing w:after="0" w:line="240" w:lineRule="auto"/>
+        <w:rPr>
+          <w:rFonts w:ascii="Arial" w:hAnsi="Arial" w:cs="Arial"/>
+        </w:rPr>
+      </w:pPr>
+      <w:r>
+        <w:rPr>
+          <w:rFonts w:ascii="Arial" w:hAnsi="Arial" w:cs="Arial"/>
+        </w:rPr>
+        <w:t xml:space="preserve">{%p if </w:t>
+      </w:r>
+      <w:proofErr w:type="spellStart"/>
+      <w:r>
+        <w:rPr>
+          <w:rFonts w:ascii="Arial" w:hAnsi="Arial" w:cs="Arial"/>
+        </w:rPr>
+        <w:t>user_wants_post_divorce_support</w:t>
+      </w:r>
+      <w:proofErr w:type="spellEnd"/>
+      <w:r>
+        <w:rPr>
+          <w:rFonts w:ascii="Arial" w:hAnsi="Arial" w:cs="Arial"/>
+        </w:rPr>
+        <w:t xml:space="preserve"> %}</w:t>
+      </w:r>
+    </w:p>
+    <w:p>
+      <w:pPr>
+        <w:rPr>
+          <w:rFonts w:ascii="Arial" w:hAnsi="Arial" w:cs="Arial"/>
+        </w:rPr>
+      </w:pPr>
+      <w:proofErr w:type="gramStart"/>
       <w:r>
         <w:rPr>
           <w:rFonts w:ascii="Arial" w:hAnsi="Arial" w:cs="Arial"/>
@@ -212,7 +249,15 @@
           <w:rFonts w:ascii="Arial" w:hAnsi="Arial" w:cs="Arial"/>
           <w:highlight w:val="yellow"/>
         </w:rPr>
-        <w:t xml:space="preserve">{% if </w:t>
+        <w:t>{%</w:t>
+      </w:r>
+      <w:proofErr w:type="gramEnd"/>
+      <w:r>
+        <w:rPr>
+          <w:rFonts w:ascii="Arial" w:hAnsi="Arial" w:cs="Arial"/>
+          <w:highlight w:val="yellow"/>
+        </w:rPr>
+        <w:t xml:space="preserve"> if </w:t>
       </w:r>
       <w:proofErr w:type="spellStart"/>
       <w:r>
@@ -234,7 +279,15 @@
           <w:rFonts w:ascii="Arial" w:hAnsi="Arial" w:cs="Arial"/>
           <w:highlight w:val="yellow"/>
         </w:rPr>
-        <w:t>_marital_children</w:t>
+        <w:t>_marital_</w:t>
+      </w:r>
+      <w:proofErr w:type="gramStart"/>
+      <w:r>
+        <w:rPr>
+          <w:rFonts w:ascii="Arial" w:hAnsi="Arial" w:cs="Arial"/>
+          <w:highlight w:val="yellow"/>
+        </w:rPr>
+        <w:t>children</w:t>
       </w:r>
       <w:proofErr w:type="spellEnd"/>
       <w:r>
@@ -257,7 +310,23 @@
           <w:rFonts w:ascii="Arial" w:hAnsi="Arial" w:cs="Arial"/>
           <w:highlight w:val="yellow"/>
         </w:rPr>
-        <w:t>{% else %}</w:t>
+        <w:t>{%</w:t>
+      </w:r>
+      <w:proofErr w:type="gramEnd"/>
+      <w:r>
+        <w:rPr>
+          <w:rFonts w:ascii="Arial" w:hAnsi="Arial" w:cs="Arial"/>
+          <w:highlight w:val="yellow"/>
+        </w:rPr>
+        <w:t xml:space="preserve"> </w:t>
+      </w:r>
+      <w:proofErr w:type="gramStart"/>
+      <w:r>
+        <w:rPr>
+          <w:rFonts w:ascii="Arial" w:hAnsi="Arial" w:cs="Arial"/>
+          <w:highlight w:val="yellow"/>
+        </w:rPr>
+        <w:t>else %}</w:t>
       </w:r>
       <w:r>
         <w:rPr>
@@ -272,8 +341,25 @@
           <w:rFonts w:ascii="Arial" w:hAnsi="Arial" w:cs="Arial"/>
           <w:highlight w:val="yellow"/>
         </w:rPr>
-        <w:t>{% endif %}</w:t>
-      </w:r>
+        <w:t>{%</w:t>
+      </w:r>
+      <w:proofErr w:type="gramEnd"/>
+      <w:r>
+        <w:rPr>
+          <w:rFonts w:ascii="Arial" w:hAnsi="Arial" w:cs="Arial"/>
+          <w:highlight w:val="yellow"/>
+        </w:rPr>
+        <w:t xml:space="preserve"> </w:t>
+      </w:r>
+      <w:proofErr w:type="gramStart"/>
+      <w:r>
+        <w:rPr>
+          <w:rFonts w:ascii="Arial" w:hAnsi="Arial" w:cs="Arial"/>
+          <w:highlight w:val="yellow"/>
+        </w:rPr>
+        <w:t>endif %}</w:t>
+      </w:r>
+      <w:proofErr w:type="gramEnd"/>
       <w:r>
         <w:rPr>
           <w:rFonts w:ascii="Arial" w:hAnsi="Arial" w:cs="Arial"/>
@@ -921,7 +1007,21 @@
         <w:rPr>
           <w:rFonts w:ascii="Arial" w:hAnsi="Arial" w:cs="Arial"/>
         </w:rPr>
-        <w:t>{{ capitalize(OP_party_label) }}</w:t>
+        <w:t>{{ capitalize(</w:t>
+      </w:r>
+      <w:proofErr w:type="spellStart"/>
+      <w:r>
+        <w:rPr>
+          <w:rFonts w:ascii="Arial" w:hAnsi="Arial" w:cs="Arial"/>
+        </w:rPr>
+        <w:t>OP_party_label</w:t>
+      </w:r>
+      <w:proofErr w:type="spellEnd"/>
+      <w:r>
+        <w:rPr>
+          <w:rFonts w:ascii="Arial" w:hAnsi="Arial" w:cs="Arial"/>
+        </w:rPr>
+        <w:t>) }}</w:t>
       </w:r>
       <w:r>
         <w:rPr>
@@ -1004,6 +1104,7 @@
           <w:b/>
           <w:bCs/>
         </w:rPr>
+        <w:lastRenderedPageBreak/>
         <w:t>The parties’ ages:</w:t>
       </w:r>
     </w:p>
@@ -1060,7 +1161,6 @@
         <w:rPr>
           <w:rFonts w:ascii="Arial" w:hAnsi="Arial" w:cs="Arial"/>
         </w:rPr>
-        <w:lastRenderedPageBreak/>
         <w:t xml:space="preserve">{{ </w:t>
       </w:r>
       <w:proofErr w:type="spellStart"/>
@@ -2043,6 +2143,7 @@
           <w:rFonts w:ascii="Arial" w:hAnsi="Arial" w:cs="Arial"/>
           <w:highlight w:val="yellow"/>
         </w:rPr>
+        <w:lastRenderedPageBreak/>
         <w:t>{%p endif %}</w:t>
       </w:r>
     </w:p>
@@ -2101,7 +2202,6 @@
           <w:b/>
           <w:bCs/>
         </w:rPr>
-        <w:lastRenderedPageBreak/>
         <w:t>The effect of cohabitation on a party’s financial status:</w:t>
       </w:r>
     </w:p>
@@ -2246,8 +2346,39 @@
           <w:rFonts w:ascii="Arial" w:hAnsi="Arial" w:cs="Arial"/>
           <w:highlight w:val="yellow"/>
         </w:rPr>
-        <w:t>{%p endif %}</w:t>
-      </w:r>
+        <w:t xml:space="preserve">{%p </w:t>
+      </w:r>
+      <w:proofErr w:type="gramStart"/>
+      <w:r>
+        <w:rPr>
+          <w:rFonts w:ascii="Arial" w:hAnsi="Arial" w:cs="Arial"/>
+          <w:highlight w:val="yellow"/>
+        </w:rPr>
+        <w:t>endif %}</w:t>
+      </w:r>
+      <w:proofErr w:type="gramEnd"/>
+    </w:p>
+    <w:p>
+      <w:pPr>
+        <w:spacing w:after="0" w:line="240" w:lineRule="auto"/>
+        <w:rPr>
+          <w:rFonts w:ascii="Arial" w:hAnsi="Arial" w:cs="Arial"/>
+        </w:rPr>
+      </w:pPr>
+      <w:r>
+        <w:rPr>
+          <w:rFonts w:ascii="Arial" w:hAnsi="Arial" w:cs="Arial"/>
+        </w:rPr>
+        <w:t xml:space="preserve">{%p </w:t>
+      </w:r>
+      <w:proofErr w:type="gramStart"/>
+      <w:r>
+        <w:rPr>
+          <w:rFonts w:ascii="Arial" w:hAnsi="Arial" w:cs="Arial"/>
+        </w:rPr>
+        <w:t>endif %}</w:t>
+      </w:r>
+      <w:proofErr w:type="gramEnd"/>
     </w:p>
     <w:sectPr>
       <w:footerReference w:type="default" r:id="rId7"/>
@@ -2377,8 +2508,36 @@
         <w:sz w:val="20"/>
         <w:szCs w:val="20"/>
       </w:rPr>
-      <w:t xml:space="preserve"> {% if tool_ID == “divorce_complaint</w:t>
-    </w:r>
+      <w:t xml:space="preserve"> {% if </w:t>
+    </w:r>
+    <w:proofErr w:type="spellStart"/>
+    <w:r>
+      <w:rPr>
+        <w:rFonts w:ascii="Arial" w:hAnsi="Arial" w:cs="Arial"/>
+        <w:sz w:val="20"/>
+        <w:szCs w:val="20"/>
+      </w:rPr>
+      <w:t>tool_ID</w:t>
+    </w:r>
+    <w:proofErr w:type="spellEnd"/>
+    <w:r>
+      <w:rPr>
+        <w:rFonts w:ascii="Arial" w:hAnsi="Arial" w:cs="Arial"/>
+        <w:sz w:val="20"/>
+        <w:szCs w:val="20"/>
+      </w:rPr>
+      <w:t xml:space="preserve"> == “</w:t>
+    </w:r>
+    <w:proofErr w:type="spellStart"/>
+    <w:r>
+      <w:rPr>
+        <w:rFonts w:ascii="Arial" w:hAnsi="Arial" w:cs="Arial"/>
+        <w:sz w:val="20"/>
+        <w:szCs w:val="20"/>
+      </w:rPr>
+      <w:t>divorce_complaint</w:t>
+    </w:r>
+    <w:proofErr w:type="spellEnd"/>
     <w:r>
       <w:rPr>
         <w:rFonts w:ascii="Arial" w:hAnsi="Arial" w:cs="Arial"/>
@@ -2393,7 +2552,16 @@
         <w:sz w:val="20"/>
         <w:szCs w:val="20"/>
       </w:rPr>
-      <w:t xml:space="preserve"> %}C</w:t>
+      <w:t xml:space="preserve"> </w:t>
+    </w:r>
+    <w:proofErr w:type="gramStart"/>
+    <w:r>
+      <w:rPr>
+        <w:rFonts w:ascii="Arial" w:hAnsi="Arial" w:cs="Arial"/>
+        <w:sz w:val="20"/>
+        <w:szCs w:val="20"/>
+      </w:rPr>
+      <w:t>%}C</w:t>
     </w:r>
     <w:r>
       <w:rPr>
@@ -2403,13 +2571,77 @@
       </w:rPr>
       <w:t>omplaint</w:t>
     </w:r>
-    <w:r>
-      <w:rPr>
-        <w:rFonts w:ascii="Arial" w:hAnsi="Arial" w:cs="Arial"/>
-        <w:sz w:val="20"/>
-        <w:szCs w:val="20"/>
-      </w:rPr>
-      <w:t>{% elif tool_ID == “divorce_answer” %}</w:t>
+    <w:proofErr w:type="gramEnd"/>
+    <w:r>
+      <w:rPr>
+        <w:rFonts w:ascii="Arial" w:hAnsi="Arial" w:cs="Arial"/>
+        <w:sz w:val="20"/>
+        <w:szCs w:val="20"/>
+      </w:rPr>
+      <w:t xml:space="preserve">{% </w:t>
+    </w:r>
+    <w:proofErr w:type="spellStart"/>
+    <w:r>
+      <w:rPr>
+        <w:rFonts w:ascii="Arial" w:hAnsi="Arial" w:cs="Arial"/>
+        <w:sz w:val="20"/>
+        <w:szCs w:val="20"/>
+      </w:rPr>
+      <w:t>elif</w:t>
+    </w:r>
+    <w:proofErr w:type="spellEnd"/>
+    <w:r>
+      <w:rPr>
+        <w:rFonts w:ascii="Arial" w:hAnsi="Arial" w:cs="Arial"/>
+        <w:sz w:val="20"/>
+        <w:szCs w:val="20"/>
+      </w:rPr>
+      <w:t xml:space="preserve"> </w:t>
+    </w:r>
+    <w:proofErr w:type="spellStart"/>
+    <w:r>
+      <w:rPr>
+        <w:rFonts w:ascii="Arial" w:hAnsi="Arial" w:cs="Arial"/>
+        <w:sz w:val="20"/>
+        <w:szCs w:val="20"/>
+      </w:rPr>
+      <w:t>tool_ID</w:t>
+    </w:r>
+    <w:proofErr w:type="spellEnd"/>
+    <w:r>
+      <w:rPr>
+        <w:rFonts w:ascii="Arial" w:hAnsi="Arial" w:cs="Arial"/>
+        <w:sz w:val="20"/>
+        <w:szCs w:val="20"/>
+      </w:rPr>
+      <w:t xml:space="preserve"> == “</w:t>
+    </w:r>
+    <w:proofErr w:type="spellStart"/>
+    <w:r>
+      <w:rPr>
+        <w:rFonts w:ascii="Arial" w:hAnsi="Arial" w:cs="Arial"/>
+        <w:sz w:val="20"/>
+        <w:szCs w:val="20"/>
+      </w:rPr>
+      <w:t>divorce_answer</w:t>
+    </w:r>
+    <w:proofErr w:type="spellEnd"/>
+    <w:r>
+      <w:rPr>
+        <w:rFonts w:ascii="Arial" w:hAnsi="Arial" w:cs="Arial"/>
+        <w:sz w:val="20"/>
+        <w:szCs w:val="20"/>
+      </w:rPr>
+      <w:t xml:space="preserve">” </w:t>
+    </w:r>
+    <w:proofErr w:type="gramStart"/>
+    <w:r>
+      <w:rPr>
+        <w:rFonts w:ascii="Arial" w:hAnsi="Arial" w:cs="Arial"/>
+        <w:sz w:val="20"/>
+        <w:szCs w:val="20"/>
+      </w:rPr>
+      <w:t>%}</w:t>
     </w:r>
     <w:r>
       <w:rPr>
@@ -2419,6 +2651,7 @@
       </w:rPr>
       <w:t>Answer</w:t>
     </w:r>
+    <w:proofErr w:type="gramEnd"/>
     <w:r>
       <w:rPr>
         <w:rFonts w:ascii="Arial" w:hAnsi="Arial" w:cs="Arial"/>
@@ -2595,7 +2828,16 @@
         <w:sz w:val="20"/>
         <w:szCs w:val="20"/>
       </w:rPr>
-      <w:t xml:space="preserve"> %}</w:t>
+      <w:t xml:space="preserve"> </w:t>
+    </w:r>
+    <w:proofErr w:type="gramStart"/>
+    <w:r>
+      <w:rPr>
+        <w:rFonts w:ascii="Arial" w:hAnsi="Arial" w:cs="Arial"/>
+        <w:sz w:val="20"/>
+        <w:szCs w:val="20"/>
+      </w:rPr>
+      <w:t>%}</w:t>
     </w:r>
     <w:r>
       <w:rPr>
@@ -2605,13 +2847,23 @@
       </w:rPr>
       <w:t>Complaint</w:t>
     </w:r>
-    <w:r>
-      <w:rPr>
-        <w:rFonts w:ascii="Arial" w:hAnsi="Arial" w:cs="Arial"/>
-        <w:sz w:val="20"/>
-        <w:szCs w:val="20"/>
-      </w:rPr>
-      <w:t>{% elif tool_ID == “divorce_answer” %}A</w:t>
+    <w:proofErr w:type="gramEnd"/>
+    <w:r>
+      <w:rPr>
+        <w:rFonts w:ascii="Arial" w:hAnsi="Arial" w:cs="Arial"/>
+        <w:sz w:val="20"/>
+        <w:szCs w:val="20"/>
+      </w:rPr>
+      <w:t xml:space="preserve">{% elif tool_ID == “divorce_answer” </w:t>
+    </w:r>
+    <w:proofErr w:type="gramStart"/>
+    <w:r>
+      <w:rPr>
+        <w:rFonts w:ascii="Arial" w:hAnsi="Arial" w:cs="Arial"/>
+        <w:sz w:val="20"/>
+        <w:szCs w:val="20"/>
+      </w:rPr>
+      <w:t>%}A</w:t>
     </w:r>
     <w:r>
       <w:rPr>
@@ -2621,6 +2873,7 @@
       </w:rPr>
       <w:t>nswer</w:t>
     </w:r>
+    <w:proofErr w:type="gramEnd"/>
     <w:r>
       <w:rPr>
         <w:rFonts w:ascii="Arial" w:hAnsi="Arial" w:cs="Arial"/>
@@ -2780,6 +3033,7 @@
               <w:szCs w:val="20"/>
             </w:rPr>
           </w:pPr>
+          <w:proofErr w:type="gramStart"/>
           <w:r>
             <w:rPr>
               <w:b/>
@@ -2798,9 +3052,30 @@
               <w:sz w:val="20"/>
               <w:szCs w:val="20"/>
             </w:rPr>
-            <w:t>the_court.number</w:t>
+            <w:t>the</w:t>
+          </w:r>
+          <w:proofErr w:type="gramEnd"/>
+          <w:r>
+            <w:rPr>
+              <w:b/>
+              <w:bCs/>
+              <w:sz w:val="20"/>
+              <w:szCs w:val="20"/>
+            </w:rPr>
+            <w:t>_</w:t>
+          </w:r>
+          <w:proofErr w:type="gramStart"/>
+          <w:r>
+            <w:rPr>
+              <w:b/>
+              <w:bCs/>
+              <w:sz w:val="20"/>
+              <w:szCs w:val="20"/>
+            </w:rPr>
+            <w:t>court.number</w:t>
           </w:r>
           <w:proofErr w:type="spellEnd"/>
+          <w:proofErr w:type="gramEnd"/>
           <w:r>
             <w:rPr>
               <w:b/>
@@ -2832,6 +3107,7 @@
               <w:szCs w:val="20"/>
             </w:rPr>
           </w:pPr>
+          <w:proofErr w:type="gramStart"/>
           <w:r>
             <w:rPr>
               <w:b/>
@@ -2850,9 +3126,9 @@
               <w:sz w:val="20"/>
               <w:szCs w:val="20"/>
             </w:rPr>
-            <w:t>county_choice.upper</w:t>
+            <w:t>county</w:t>
           </w:r>
-          <w:proofErr w:type="spellEnd"/>
+          <w:proofErr w:type="gramEnd"/>
           <w:r>
             <w:rPr>
               <w:b/>
@@ -2860,7 +3136,38 @@
               <w:sz w:val="20"/>
               <w:szCs w:val="20"/>
             </w:rPr>
-            <w:t>()</w:t>
+            <w:t>_</w:t>
+          </w:r>
+          <w:proofErr w:type="gramStart"/>
+          <w:r>
+            <w:rPr>
+              <w:b/>
+              <w:bCs/>
+              <w:sz w:val="20"/>
+              <w:szCs w:val="20"/>
+            </w:rPr>
+            <w:t>choice.upper</w:t>
+          </w:r>
+          <w:proofErr w:type="spellEnd"/>
+          <w:proofErr w:type="gramEnd"/>
+          <w:r>
+            <w:rPr>
+              <w:b/>
+              <w:bCs/>
+              <w:sz w:val="20"/>
+              <w:szCs w:val="20"/>
+            </w:rPr>
+            <w:t>(</w:t>
+          </w:r>
+          <w:proofErr w:type="gramStart"/>
+          <w:r>
+            <w:rPr>
+              <w:b/>
+              <w:bCs/>
+              <w:sz w:val="20"/>
+              <w:szCs w:val="20"/>
+            </w:rPr>
+            <w:t>)</w:t>
           </w:r>
           <w:r>
             <w:rPr>
@@ -2870,7 +3177,18 @@
               <w:sz w:val="20"/>
               <w:szCs w:val="20"/>
             </w:rPr>
-            <w:t xml:space="preserve"> }} </w:t>
+            <w:t xml:space="preserve"> }</w:t>
+          </w:r>
+          <w:proofErr w:type="gramEnd"/>
+          <w:r>
+            <w:rPr>
+              <w:b/>
+              <w:bCs/>
+              <w:caps/>
+              <w:sz w:val="20"/>
+              <w:szCs w:val="20"/>
+            </w:rPr>
+            <w:t xml:space="preserve">} </w:t>
           </w:r>
           <w:r>
             <w:rPr>
@@ -2947,7 +3265,15 @@
               <w:sz w:val="20"/>
               <w:szCs w:val="20"/>
             </w:rPr>
-            <w:t>{% if tool_ID == “divorce_complaint” %}</w:t>
+            <w:t xml:space="preserve">{% if tool_ID == “divorce_complaint” </w:t>
+          </w:r>
+          <w:proofErr w:type="gramStart"/>
+          <w:r>
+            <w:rPr>
+              <w:sz w:val="20"/>
+              <w:szCs w:val="20"/>
+            </w:rPr>
+            <w:t>%}</w:t>
           </w:r>
           <w:r>
             <w:rPr>
@@ -2958,12 +3284,21 @@
             </w:rPr>
             <w:t>COMPLAINT</w:t>
           </w:r>
+          <w:proofErr w:type="gramEnd"/>
           <w:r>
             <w:rPr>
               <w:sz w:val="20"/>
               <w:szCs w:val="20"/>
             </w:rPr>
-            <w:t>{% elif tool_ID == “divorce_answer” %}</w:t>
+            <w:t xml:space="preserve">{% elif tool_ID == “divorce_answer” </w:t>
+          </w:r>
+          <w:proofErr w:type="gramStart"/>
+          <w:r>
+            <w:rPr>
+              <w:sz w:val="20"/>
+              <w:szCs w:val="20"/>
+            </w:rPr>
+            <w:t>%}</w:t>
           </w:r>
           <w:r>
             <w:rPr>
@@ -2974,6 +3309,7 @@
             </w:rPr>
             <w:t>ANSWER</w:t>
           </w:r>
+          <w:proofErr w:type="gramEnd"/>
           <w:r>
             <w:rPr>
               <w:sz w:val="20"/>
@@ -3025,6 +3361,7 @@
               <w:szCs w:val="20"/>
             </w:rPr>
           </w:pPr>
+          <w:proofErr w:type="gramStart"/>
           <w:r>
             <w:rPr>
               <w:b/>
@@ -3042,7 +3379,17 @@
               <w:sz w:val="20"/>
               <w:szCs w:val="20"/>
             </w:rPr>
-            <w:t>docket_number</w:t>
+            <w:t>docket</w:t>
+          </w:r>
+          <w:proofErr w:type="gramEnd"/>
+          <w:r>
+            <w:rPr>
+              <w:b/>
+              <w:bCs/>
+              <w:sz w:val="20"/>
+              <w:szCs w:val="20"/>
+            </w:rPr>
+            <w:t>_number</w:t>
           </w:r>
           <w:proofErr w:type="spellEnd"/>
           <w:r>

</xml_diff>

<commit_message>
adjust enabling logic, make skip undefined True, adjust addendum template labeling and logic
</commit_message>
<xml_diff>
--- a/docassemble/MLHDivorceAndCustody/data/templates/complaint_answer_attachment.docx
+++ b/docassemble/MLHDivorceAndCustody/data/templates/complaint_answer_attachment.docx
@@ -19,49 +19,133 @@
         <w:rPr>
           <w:rFonts w:ascii="Arial" w:hAnsi="Arial" w:cs="Arial"/>
         </w:rPr>
-        <w:t>(</w:t>
-      </w:r>
-      <w:r>
-        <w:rPr>
-          <w:rFonts w:ascii="Arial" w:hAnsi="Arial" w:cs="Arial"/>
-        </w:rPr>
-        <w:t>PT_type in [“specific”, “supervised”]</w:t>
-      </w:r>
-      <w:r>
-        <w:rPr>
-          <w:rFonts w:ascii="Arial" w:hAnsi="Arial" w:cs="Arial"/>
-        </w:rPr>
-        <w:t>)</w:t>
-      </w:r>
-      <w:r>
-        <w:rPr>
-          <w:rFonts w:ascii="Arial" w:hAnsi="Arial" w:cs="Arial"/>
-        </w:rPr>
-        <w:t xml:space="preserve"> and </w:t>
-      </w:r>
-      <w:r>
-        <w:rPr>
-          <w:rFonts w:ascii="Arial" w:hAnsi="Arial" w:cs="Arial"/>
-        </w:rPr>
-        <w:t>(</w:t>
-      </w:r>
-      <w:r>
-        <w:rPr>
-          <w:rFonts w:ascii="Arial" w:hAnsi="Arial" w:cs="Arial"/>
-        </w:rPr>
-        <w:t>specific_PT_how == “custom”</w:t>
-      </w:r>
-      <w:r>
-        <w:rPr>
-          <w:rFonts w:ascii="Arial" w:hAnsi="Arial" w:cs="Arial"/>
-        </w:rPr>
-        <w:t>)</w:t>
-      </w:r>
-      <w:r>
-        <w:rPr>
-          <w:rFonts w:ascii="Arial" w:hAnsi="Arial" w:cs="Arial"/>
-        </w:rPr>
-        <w:t xml:space="preserve"> %}</w:t>
+        <w:t>((</w:t>
+      </w:r>
+      <w:proofErr w:type="spellStart"/>
+      <w:r>
+        <w:rPr>
+          <w:rFonts w:ascii="Arial" w:hAnsi="Arial" w:cs="Arial"/>
+        </w:rPr>
+        <w:t>tool_ID</w:t>
+      </w:r>
+      <w:proofErr w:type="spellEnd"/>
+      <w:r>
+        <w:rPr>
+          <w:rFonts w:ascii="Arial" w:hAnsi="Arial" w:cs="Arial"/>
+        </w:rPr>
+        <w:t xml:space="preserve"> == “</w:t>
+      </w:r>
+      <w:proofErr w:type="spellStart"/>
+      <w:r>
+        <w:rPr>
+          <w:rFonts w:ascii="Arial" w:hAnsi="Arial" w:cs="Arial"/>
+        </w:rPr>
+        <w:t>divorce_complaint</w:t>
+      </w:r>
+      <w:proofErr w:type="spellEnd"/>
+      <w:r>
+        <w:rPr>
+          <w:rFonts w:ascii="Arial" w:hAnsi="Arial" w:cs="Arial"/>
+        </w:rPr>
+        <w:t xml:space="preserve">” and </w:t>
+      </w:r>
+      <w:proofErr w:type="spellStart"/>
+      <w:r>
+        <w:rPr>
+          <w:rFonts w:ascii="Arial" w:hAnsi="Arial" w:cs="Arial"/>
+        </w:rPr>
+        <w:t>there_are_marital_children</w:t>
+      </w:r>
+      <w:proofErr w:type="spellEnd"/>
+      <w:r>
+        <w:rPr>
+          <w:rFonts w:ascii="Arial" w:hAnsi="Arial" w:cs="Arial"/>
+        </w:rPr>
+        <w:t>) or (</w:t>
+      </w:r>
+      <w:proofErr w:type="spellStart"/>
+      <w:r>
+        <w:rPr>
+          <w:rFonts w:ascii="Arial" w:hAnsi="Arial" w:cs="Arial"/>
+        </w:rPr>
+        <w:t>tool_ID</w:t>
+      </w:r>
+      <w:proofErr w:type="spellEnd"/>
+      <w:r>
+        <w:rPr>
+          <w:rFonts w:ascii="Arial" w:hAnsi="Arial" w:cs="Arial"/>
+        </w:rPr>
+        <w:t xml:space="preserve"> == “</w:t>
+      </w:r>
+      <w:proofErr w:type="spellStart"/>
+      <w:r>
+        <w:rPr>
+          <w:rFonts w:ascii="Arial" w:hAnsi="Arial" w:cs="Arial"/>
+        </w:rPr>
+        <w:t>divorce_answer</w:t>
+      </w:r>
+      <w:proofErr w:type="spellEnd"/>
+      <w:r>
+        <w:rPr>
+          <w:rFonts w:ascii="Arial" w:hAnsi="Arial" w:cs="Arial"/>
+        </w:rPr>
+        <w:t xml:space="preserve">” and </w:t>
+      </w:r>
+      <w:proofErr w:type="spellStart"/>
+      <w:r>
+        <w:rPr>
+          <w:rFonts w:ascii="Arial" w:hAnsi="Arial" w:cs="Arial"/>
+        </w:rPr>
+        <w:t>complaint_type</w:t>
+      </w:r>
+      <w:proofErr w:type="spellEnd"/>
+      <w:r>
+        <w:rPr>
+          <w:rFonts w:ascii="Arial" w:hAnsi="Arial" w:cs="Arial"/>
+        </w:rPr>
+        <w:t xml:space="preserve"> == “</w:t>
+      </w:r>
+      <w:proofErr w:type="spellStart"/>
+      <w:r>
+        <w:rPr>
+          <w:rFonts w:ascii="Arial" w:hAnsi="Arial" w:cs="Arial"/>
+        </w:rPr>
+        <w:t>with_children</w:t>
+      </w:r>
+      <w:proofErr w:type="spellEnd"/>
+      <w:r>
+        <w:rPr>
+          <w:rFonts w:ascii="Arial" w:hAnsi="Arial" w:cs="Arial"/>
+        </w:rPr>
+        <w:t xml:space="preserve">”)) and </w:t>
+      </w:r>
+      <w:proofErr w:type="spellStart"/>
+      <w:r>
+        <w:rPr>
+          <w:rFonts w:ascii="Arial" w:hAnsi="Arial" w:cs="Arial"/>
+        </w:rPr>
+        <w:t>PT_type</w:t>
+      </w:r>
+      <w:proofErr w:type="spellEnd"/>
+      <w:r>
+        <w:rPr>
+          <w:rFonts w:ascii="Arial" w:hAnsi="Arial" w:cs="Arial"/>
+        </w:rPr>
+        <w:t xml:space="preserve"> in [“specific”, “supervised”] and </w:t>
+      </w:r>
+      <w:proofErr w:type="spellStart"/>
+      <w:r>
+        <w:rPr>
+          <w:rFonts w:ascii="Arial" w:hAnsi="Arial" w:cs="Arial"/>
+        </w:rPr>
+        <w:t>specific_PT_how</w:t>
+      </w:r>
+      <w:proofErr w:type="spellEnd"/>
+      <w:r>
+        <w:rPr>
+          <w:rFonts w:ascii="Arial" w:hAnsi="Arial" w:cs="Arial"/>
+        </w:rPr>
+        <w:t xml:space="preserve"> == “custom” %}</w:t>
       </w:r>
     </w:p>
     <w:p>
@@ -235,7 +319,6 @@
           <w:rFonts w:ascii="Arial" w:hAnsi="Arial" w:cs="Arial"/>
         </w:rPr>
       </w:pPr>
-      <w:proofErr w:type="gramStart"/>
       <w:r>
         <w:rPr>
           <w:rFonts w:ascii="Arial" w:hAnsi="Arial" w:cs="Arial"/>
@@ -249,15 +332,7 @@
           <w:rFonts w:ascii="Arial" w:hAnsi="Arial" w:cs="Arial"/>
           <w:highlight w:val="yellow"/>
         </w:rPr>
-        <w:t>{%</w:t>
-      </w:r>
-      <w:proofErr w:type="gramEnd"/>
-      <w:r>
-        <w:rPr>
-          <w:rFonts w:ascii="Arial" w:hAnsi="Arial" w:cs="Arial"/>
-          <w:highlight w:val="yellow"/>
-        </w:rPr>
-        <w:t xml:space="preserve"> if </w:t>
+        <w:t xml:space="preserve">{% if </w:t>
       </w:r>
       <w:proofErr w:type="spellStart"/>
       <w:r>
@@ -279,15 +354,7 @@
           <w:rFonts w:ascii="Arial" w:hAnsi="Arial" w:cs="Arial"/>
           <w:highlight w:val="yellow"/>
         </w:rPr>
-        <w:t>_marital_</w:t>
-      </w:r>
-      <w:proofErr w:type="gramStart"/>
-      <w:r>
-        <w:rPr>
-          <w:rFonts w:ascii="Arial" w:hAnsi="Arial" w:cs="Arial"/>
-          <w:highlight w:val="yellow"/>
-        </w:rPr>
-        <w:t>children</w:t>
+        <w:t>_marital_children</w:t>
       </w:r>
       <w:proofErr w:type="spellEnd"/>
       <w:r>
@@ -310,9 +377,24 @@
           <w:rFonts w:ascii="Arial" w:hAnsi="Arial" w:cs="Arial"/>
           <w:highlight w:val="yellow"/>
         </w:rPr>
-        <w:t>{%</w:t>
-      </w:r>
-      <w:proofErr w:type="gramEnd"/>
+        <w:t xml:space="preserve">{% </w:t>
+      </w:r>
+      <w:proofErr w:type="spellStart"/>
+      <w:r>
+        <w:rPr>
+          <w:rFonts w:ascii="Arial" w:hAnsi="Arial" w:cs="Arial"/>
+          <w:highlight w:val="yellow"/>
+        </w:rPr>
+        <w:t>el</w:t>
+      </w:r>
+      <w:r>
+        <w:rPr>
+          <w:rFonts w:ascii="Arial" w:hAnsi="Arial" w:cs="Arial"/>
+          <w:highlight w:val="yellow"/>
+        </w:rPr>
+        <w:t>if</w:t>
+      </w:r>
+      <w:proofErr w:type="spellEnd"/>
       <w:r>
         <w:rPr>
           <w:rFonts w:ascii="Arial" w:hAnsi="Arial" w:cs="Arial"/>
@@ -320,13 +402,44 @@
         </w:rPr>
         <w:t xml:space="preserve"> </w:t>
       </w:r>
-      <w:proofErr w:type="gramStart"/>
-      <w:r>
-        <w:rPr>
-          <w:rFonts w:ascii="Arial" w:hAnsi="Arial" w:cs="Arial"/>
-          <w:highlight w:val="yellow"/>
-        </w:rPr>
-        <w:t>else %}</w:t>
+      <w:proofErr w:type="spellStart"/>
+      <w:r>
+        <w:rPr>
+          <w:rFonts w:ascii="Arial" w:hAnsi="Arial" w:cs="Arial"/>
+          <w:highlight w:val="yellow"/>
+        </w:rPr>
+        <w:t>tool_ID</w:t>
+      </w:r>
+      <w:proofErr w:type="spellEnd"/>
+      <w:r>
+        <w:rPr>
+          <w:rFonts w:ascii="Arial" w:hAnsi="Arial" w:cs="Arial"/>
+          <w:highlight w:val="yellow"/>
+        </w:rPr>
+        <w:t xml:space="preserve"> == “</w:t>
+      </w:r>
+      <w:proofErr w:type="spellStart"/>
+      <w:r>
+        <w:rPr>
+          <w:rFonts w:ascii="Arial" w:hAnsi="Arial" w:cs="Arial"/>
+          <w:highlight w:val="yellow"/>
+        </w:rPr>
+        <w:t>divorce_complaint</w:t>
+      </w:r>
+      <w:proofErr w:type="spellEnd"/>
+      <w:r>
+        <w:rPr>
+          <w:rFonts w:ascii="Arial" w:hAnsi="Arial" w:cs="Arial"/>
+          <w:highlight w:val="yellow"/>
+        </w:rPr>
+        <w:t>”</w:t>
+      </w:r>
+      <w:r>
+        <w:rPr>
+          <w:rFonts w:ascii="Arial" w:hAnsi="Arial" w:cs="Arial"/>
+          <w:highlight w:val="yellow"/>
+        </w:rPr>
+        <w:t xml:space="preserve"> %}</w:t>
       </w:r>
       <w:r>
         <w:rPr>
@@ -341,38 +454,36 @@
           <w:rFonts w:ascii="Arial" w:hAnsi="Arial" w:cs="Arial"/>
           <w:highlight w:val="yellow"/>
         </w:rPr>
-        <w:t>{%</w:t>
-      </w:r>
-      <w:proofErr w:type="gramEnd"/>
-      <w:r>
-        <w:rPr>
-          <w:rFonts w:ascii="Arial" w:hAnsi="Arial" w:cs="Arial"/>
-          <w:highlight w:val="yellow"/>
-        </w:rPr>
-        <w:t xml:space="preserve"> </w:t>
-      </w:r>
-      <w:proofErr w:type="gramStart"/>
-      <w:r>
-        <w:rPr>
-          <w:rFonts w:ascii="Arial" w:hAnsi="Arial" w:cs="Arial"/>
-          <w:highlight w:val="yellow"/>
-        </w:rPr>
-        <w:t>endif %}</w:t>
-      </w:r>
-      <w:proofErr w:type="gramEnd"/>
+        <w:t>{% el</w:t>
+      </w:r>
+      <w:r>
+        <w:rPr>
+          <w:rFonts w:ascii="Arial" w:hAnsi="Arial" w:cs="Arial"/>
+          <w:highlight w:val="yellow"/>
+        </w:rPr>
+        <w:t xml:space="preserve">se </w:t>
+      </w:r>
+      <w:r>
+        <w:rPr>
+          <w:rFonts w:ascii="Arial" w:hAnsi="Arial" w:cs="Arial"/>
+          <w:highlight w:val="yellow"/>
+        </w:rPr>
+        <w:t>%}</w:t>
+      </w:r>
       <w:r>
         <w:rPr>
           <w:rFonts w:ascii="Arial" w:hAnsi="Arial" w:cs="Arial"/>
           <w:b/>
           <w:bCs/>
         </w:rPr>
-        <w:t>)</w:t>
-      </w:r>
-      <w:r>
-        <w:rPr>
-          <w:rFonts w:ascii="Arial" w:hAnsi="Arial" w:cs="Arial"/>
-        </w:rPr>
-        <w:t xml:space="preserve"> </w:t>
+        <w:t>9</w:t>
+      </w:r>
+      <w:r>
+        <w:rPr>
+          <w:rFonts w:ascii="Arial" w:hAnsi="Arial" w:cs="Arial"/>
+          <w:highlight w:val="yellow"/>
+        </w:rPr>
+        <w:t>{% endif %}</w:t>
       </w:r>
       <w:r>
         <w:rPr>
@@ -380,7 +491,13 @@
           <w:b/>
           <w:bCs/>
         </w:rPr>
-        <w:t xml:space="preserve">Spousal </w:t>
+        <w:t>)</w:t>
+      </w:r>
+      <w:r>
+        <w:rPr>
+          <w:rFonts w:ascii="Arial" w:hAnsi="Arial" w:cs="Arial"/>
+        </w:rPr>
+        <w:t xml:space="preserve"> </w:t>
       </w:r>
       <w:r>
         <w:rPr>
@@ -388,7 +505,7 @@
           <w:b/>
           <w:bCs/>
         </w:rPr>
-        <w:t>S</w:t>
+        <w:t xml:space="preserve">Spousal </w:t>
       </w:r>
       <w:r>
         <w:rPr>
@@ -396,128 +513,136 @@
           <w:b/>
           <w:bCs/>
         </w:rPr>
-        <w:t>upport</w:t>
-      </w:r>
-    </w:p>
-    <w:p>
-      <w:pPr>
-        <w:spacing w:after="0"/>
-        <w:rPr>
-          <w:rFonts w:ascii="Arial" w:hAnsi="Arial" w:cs="Arial"/>
-        </w:rPr>
-      </w:pPr>
-      <w:r>
-        <w:rPr>
-          <w:rFonts w:ascii="Arial" w:hAnsi="Arial" w:cs="Arial"/>
-        </w:rPr>
-        <w:t xml:space="preserve">The following facts show </w:t>
-      </w:r>
-      <w:r>
-        <w:rPr>
-          <w:rFonts w:ascii="Arial" w:hAnsi="Arial" w:cs="Arial"/>
-        </w:rPr>
-        <w:t xml:space="preserve">{{ </w:t>
-      </w:r>
-      <w:proofErr w:type="spellStart"/>
-      <w:r>
-        <w:rPr>
-          <w:rFonts w:ascii="Arial" w:hAnsi="Arial" w:cs="Arial"/>
-        </w:rPr>
-        <w:t>user_party_label</w:t>
-      </w:r>
-      <w:proofErr w:type="spellEnd"/>
-      <w:r>
-        <w:rPr>
-          <w:rFonts w:ascii="Arial" w:hAnsi="Arial" w:cs="Arial"/>
-        </w:rPr>
-        <w:t xml:space="preserve"> }}</w:t>
-      </w:r>
-      <w:r>
-        <w:rPr>
-          <w:rFonts w:ascii="Arial" w:hAnsi="Arial" w:cs="Arial"/>
-        </w:rPr>
-        <w:t xml:space="preserve">’s need for spousal support and </w:t>
-      </w:r>
-      <w:r>
-        <w:rPr>
-          <w:rFonts w:ascii="Arial" w:hAnsi="Arial" w:cs="Arial"/>
-        </w:rPr>
-        <w:t xml:space="preserve">{{ </w:t>
-      </w:r>
-      <w:r>
-        <w:rPr>
-          <w:rFonts w:ascii="Arial" w:hAnsi="Arial" w:cs="Arial"/>
-        </w:rPr>
-        <w:t>OP_party_label</w:t>
-      </w:r>
-      <w:r>
-        <w:rPr>
-          <w:rFonts w:ascii="Arial" w:hAnsi="Arial" w:cs="Arial"/>
-        </w:rPr>
-        <w:t xml:space="preserve"> }}</w:t>
-      </w:r>
-      <w:r>
-        <w:rPr>
-          <w:rFonts w:ascii="Arial" w:hAnsi="Arial" w:cs="Arial"/>
-        </w:rPr>
-        <w:t>'s ability to pay:</w:t>
-      </w:r>
-    </w:p>
-    <w:p>
-      <w:pPr>
-        <w:spacing w:after="0" w:line="240" w:lineRule="auto"/>
-        <w:rPr>
-          <w:rFonts w:ascii="Arial" w:hAnsi="Arial" w:cs="Arial"/>
-        </w:rPr>
-      </w:pPr>
-      <w:r>
-        <w:rPr>
-          <w:rFonts w:ascii="Arial" w:hAnsi="Arial" w:cs="Arial"/>
-          <w:highlight w:val="yellow"/>
-        </w:rPr>
-        <w:t xml:space="preserve">{%p if </w:t>
-      </w:r>
-      <w:proofErr w:type="spellStart"/>
-      <w:r>
-        <w:rPr>
-          <w:rFonts w:ascii="Arial" w:hAnsi="Arial" w:cs="Arial"/>
-          <w:highlight w:val="yellow"/>
-        </w:rPr>
-        <w:t>ss_factor_one_division_labor</w:t>
-      </w:r>
-      <w:proofErr w:type="spellEnd"/>
-      <w:r>
-        <w:rPr>
-          <w:rFonts w:ascii="Arial" w:hAnsi="Arial" w:cs="Arial"/>
-          <w:highlight w:val="yellow"/>
-        </w:rPr>
-        <w:t xml:space="preserve"> != “” or ss_factor_one_fault != “” %}</w:t>
-      </w:r>
-    </w:p>
-    <w:p>
-      <w:pPr>
-        <w:spacing w:after="0" w:line="240" w:lineRule="auto"/>
-        <w:rPr>
-          <w:rFonts w:ascii="Arial" w:hAnsi="Arial" w:cs="Arial"/>
-        </w:rPr>
-      </w:pPr>
-    </w:p>
-    <w:p>
-      <w:pPr>
-        <w:keepNext/>
-        <w:spacing w:after="0" w:line="240" w:lineRule="auto"/>
+        <w:t>S</w:t>
+      </w:r>
+      <w:r>
         <w:rPr>
           <w:rFonts w:ascii="Arial" w:hAnsi="Arial" w:cs="Arial"/>
           <w:b/>
           <w:bCs/>
         </w:rPr>
-      </w:pPr>
-      <w:r>
+        <w:t>upport</w:t>
+      </w:r>
+    </w:p>
+    <w:p>
+      <w:pPr>
+        <w:spacing w:after="0"/>
+        <w:rPr>
+          <w:rFonts w:ascii="Arial" w:hAnsi="Arial" w:cs="Arial"/>
+        </w:rPr>
+      </w:pPr>
+      <w:r>
+        <w:rPr>
+          <w:rFonts w:ascii="Arial" w:hAnsi="Arial" w:cs="Arial"/>
+        </w:rPr>
+        <w:t xml:space="preserve">The following facts show </w:t>
+      </w:r>
+      <w:r>
+        <w:rPr>
+          <w:rFonts w:ascii="Arial" w:hAnsi="Arial" w:cs="Arial"/>
+        </w:rPr>
+        <w:t xml:space="preserve">{{ </w:t>
+      </w:r>
+      <w:proofErr w:type="spellStart"/>
+      <w:r>
+        <w:rPr>
+          <w:rFonts w:ascii="Arial" w:hAnsi="Arial" w:cs="Arial"/>
+        </w:rPr>
+        <w:t>user_party_label</w:t>
+      </w:r>
+      <w:proofErr w:type="spellEnd"/>
+      <w:r>
+        <w:rPr>
+          <w:rFonts w:ascii="Arial" w:hAnsi="Arial" w:cs="Arial"/>
+        </w:rPr>
+        <w:t xml:space="preserve"> }}</w:t>
+      </w:r>
+      <w:r>
+        <w:rPr>
+          <w:rFonts w:ascii="Arial" w:hAnsi="Arial" w:cs="Arial"/>
+        </w:rPr>
+        <w:t xml:space="preserve">’s need for spousal support and </w:t>
+      </w:r>
+      <w:r>
+        <w:rPr>
+          <w:rFonts w:ascii="Arial" w:hAnsi="Arial" w:cs="Arial"/>
+        </w:rPr>
+        <w:t xml:space="preserve">{{ </w:t>
+      </w:r>
+      <w:r>
+        <w:rPr>
+          <w:rFonts w:ascii="Arial" w:hAnsi="Arial" w:cs="Arial"/>
+        </w:rPr>
+        <w:t>OP_party_label</w:t>
+      </w:r>
+      <w:r>
+        <w:rPr>
+          <w:rFonts w:ascii="Arial" w:hAnsi="Arial" w:cs="Arial"/>
+        </w:rPr>
+        <w:t xml:space="preserve"> }}</w:t>
+      </w:r>
+      <w:r>
+        <w:rPr>
+          <w:rFonts w:ascii="Arial" w:hAnsi="Arial" w:cs="Arial"/>
+        </w:rPr>
+        <w:t>'s ability to pay:</w:t>
+      </w:r>
+    </w:p>
+    <w:p>
+      <w:pPr>
+        <w:spacing w:after="0" w:line="240" w:lineRule="auto"/>
+        <w:rPr>
+          <w:rFonts w:ascii="Arial" w:hAnsi="Arial" w:cs="Arial"/>
+        </w:rPr>
+      </w:pPr>
+      <w:r>
+        <w:rPr>
+          <w:rFonts w:ascii="Arial" w:hAnsi="Arial" w:cs="Arial"/>
+          <w:highlight w:val="yellow"/>
+        </w:rPr>
+        <w:t xml:space="preserve">{%p if </w:t>
+      </w:r>
+      <w:proofErr w:type="spellStart"/>
+      <w:r>
+        <w:rPr>
+          <w:rFonts w:ascii="Arial" w:hAnsi="Arial" w:cs="Arial"/>
+          <w:highlight w:val="yellow"/>
+        </w:rPr>
+        <w:t>ss_factor_one_division_labor</w:t>
+      </w:r>
+      <w:proofErr w:type="spellEnd"/>
+      <w:r>
+        <w:rPr>
+          <w:rFonts w:ascii="Arial" w:hAnsi="Arial" w:cs="Arial"/>
+          <w:highlight w:val="yellow"/>
+        </w:rPr>
+        <w:t xml:space="preserve"> != “” or ss_factor_one_fault != “” %}</w:t>
+      </w:r>
+    </w:p>
+    <w:p>
+      <w:pPr>
+        <w:spacing w:after="0" w:line="240" w:lineRule="auto"/>
+        <w:rPr>
+          <w:rFonts w:ascii="Arial" w:hAnsi="Arial" w:cs="Arial"/>
+        </w:rPr>
+      </w:pPr>
+    </w:p>
+    <w:p>
+      <w:pPr>
+        <w:keepNext/>
+        <w:spacing w:after="0" w:line="240" w:lineRule="auto"/>
         <w:rPr>
           <w:rFonts w:ascii="Arial" w:hAnsi="Arial" w:cs="Arial"/>
           <w:b/>
           <w:bCs/>
         </w:rPr>
+      </w:pPr>
+      <w:r>
+        <w:rPr>
+          <w:rFonts w:ascii="Arial" w:hAnsi="Arial" w:cs="Arial"/>
+          <w:b/>
+          <w:bCs/>
+        </w:rPr>
         <w:t>The past relations and conduct of the parties:</w:t>
       </w:r>
     </w:p>
@@ -1077,6 +1202,7 @@
           <w:rFonts w:ascii="Arial" w:hAnsi="Arial" w:cs="Arial"/>
           <w:highlight w:val="yellow"/>
         </w:rPr>
+        <w:lastRenderedPageBreak/>
         <w:t>{%p endif %}</w:t>
       </w:r>
     </w:p>
@@ -1104,7 +1230,6 @@
           <w:b/>
           <w:bCs/>
         </w:rPr>
-        <w:lastRenderedPageBreak/>
         <w:t>The parties’ ages:</w:t>
       </w:r>
     </w:p>
@@ -2100,6 +2225,7 @@
           <w:b/>
           <w:bCs/>
         </w:rPr>
+        <w:lastRenderedPageBreak/>
         <w:t>The parties’ fault in causing the divorce:</w:t>
       </w:r>
     </w:p>
@@ -2110,6 +2236,7 @@
           <w:rFonts w:ascii="Arial" w:hAnsi="Arial" w:cs="Arial"/>
         </w:rPr>
       </w:pPr>
+      <w:proofErr w:type="gramStart"/>
       <w:r>
         <w:rPr>
           <w:rFonts w:ascii="Arial" w:hAnsi="Arial" w:cs="Arial"/>
@@ -2121,29 +2248,49 @@
         <w:rPr>
           <w:rFonts w:ascii="Arial" w:hAnsi="Arial" w:cs="Arial"/>
         </w:rPr>
-        <w:t>ss_factor_twelve_fault_redux</w:t>
-      </w:r>
-      <w:proofErr w:type="spellEnd"/>
-      <w:r>
-        <w:rPr>
-          <w:rFonts w:ascii="Arial" w:hAnsi="Arial" w:cs="Arial"/>
-        </w:rPr>
-        <w:t xml:space="preserve"> }}</w:t>
-      </w:r>
-    </w:p>
-    <w:p>
-      <w:pPr>
-        <w:spacing w:after="0" w:line="240" w:lineRule="auto"/>
-        <w:rPr>
-          <w:rFonts w:ascii="Arial" w:hAnsi="Arial" w:cs="Arial"/>
-        </w:rPr>
-      </w:pPr>
-      <w:r>
-        <w:rPr>
-          <w:rFonts w:ascii="Arial" w:hAnsi="Arial" w:cs="Arial"/>
-          <w:highlight w:val="yellow"/>
-        </w:rPr>
-        <w:lastRenderedPageBreak/>
+        <w:t>ss</w:t>
+      </w:r>
+      <w:proofErr w:type="gramEnd"/>
+      <w:r>
+        <w:rPr>
+          <w:rFonts w:ascii="Arial" w:hAnsi="Arial" w:cs="Arial"/>
+        </w:rPr>
+        <w:t>_factor_twelve_fault_</w:t>
+      </w:r>
+      <w:proofErr w:type="gramStart"/>
+      <w:r>
+        <w:rPr>
+          <w:rFonts w:ascii="Arial" w:hAnsi="Arial" w:cs="Arial"/>
+        </w:rPr>
+        <w:t>redux</w:t>
+      </w:r>
+      <w:proofErr w:type="spellEnd"/>
+      <w:r>
+        <w:rPr>
+          <w:rFonts w:ascii="Arial" w:hAnsi="Arial" w:cs="Arial"/>
+        </w:rPr>
+        <w:t xml:space="preserve"> }</w:t>
+      </w:r>
+      <w:proofErr w:type="gramEnd"/>
+      <w:r>
+        <w:rPr>
+          <w:rFonts w:ascii="Arial" w:hAnsi="Arial" w:cs="Arial"/>
+        </w:rPr>
+        <w:t>}</w:t>
+      </w:r>
+    </w:p>
+    <w:p>
+      <w:pPr>
+        <w:spacing w:after="0" w:line="240" w:lineRule="auto"/>
+        <w:rPr>
+          <w:rFonts w:ascii="Arial" w:hAnsi="Arial" w:cs="Arial"/>
+        </w:rPr>
+      </w:pPr>
+      <w:r>
+        <w:rPr>
+          <w:rFonts w:ascii="Arial" w:hAnsi="Arial" w:cs="Arial"/>
+          <w:highlight w:val="yellow"/>
+        </w:rPr>
         <w:t>{%p endif %}</w:t>
       </w:r>
     </w:p>
@@ -2492,23 +2639,7 @@
         <w:sz w:val="20"/>
         <w:szCs w:val="20"/>
       </w:rPr>
-      <w:t>D</w:t>
-    </w:r>
-    <w:r>
-      <w:rPr>
-        <w:rFonts w:ascii="Arial" w:hAnsi="Arial" w:cs="Arial"/>
-        <w:sz w:val="20"/>
-        <w:szCs w:val="20"/>
-      </w:rPr>
-      <w:t>ivorce</w:t>
-    </w:r>
-    <w:r>
-      <w:rPr>
-        <w:rFonts w:ascii="Arial" w:hAnsi="Arial" w:cs="Arial"/>
-        <w:sz w:val="20"/>
-        <w:szCs w:val="20"/>
-      </w:rPr>
-      <w:t xml:space="preserve"> {% if </w:t>
+      <w:t xml:space="preserve">{% if </w:t>
     </w:r>
     <w:proofErr w:type="spellStart"/>
     <w:r>
@@ -2649,7 +2780,7 @@
         <w:sz w:val="20"/>
         <w:szCs w:val="20"/>
       </w:rPr>
-      <w:t>Answer</w:t>
+      <w:t>Counterclaim</w:t>
     </w:r>
     <w:proofErr w:type="gramEnd"/>
     <w:r>
@@ -2659,6 +2790,14 @@
         <w:szCs w:val="20"/>
       </w:rPr>
       <w:t>{% endif %}</w:t>
+    </w:r>
+    <w:r>
+      <w:rPr>
+        <w:rFonts w:ascii="Arial" w:hAnsi="Arial" w:cs="Arial"/>
+        <w:sz w:val="20"/>
+        <w:szCs w:val="20"/>
+      </w:rPr>
+      <w:t xml:space="preserve"> for Divorce</w:t>
     </w:r>
   </w:p>
   <w:p>
@@ -2796,23 +2935,7 @@
         <w:sz w:val="20"/>
         <w:szCs w:val="20"/>
       </w:rPr>
-      <w:t>D</w:t>
-    </w:r>
-    <w:r>
-      <w:rPr>
-        <w:rFonts w:ascii="Arial" w:hAnsi="Arial" w:cs="Arial"/>
-        <w:sz w:val="20"/>
-        <w:szCs w:val="20"/>
-      </w:rPr>
-      <w:t>ivorce</w:t>
-    </w:r>
-    <w:r>
-      <w:rPr>
-        <w:rFonts w:ascii="Arial" w:hAnsi="Arial" w:cs="Arial"/>
-        <w:sz w:val="20"/>
-        <w:szCs w:val="20"/>
-      </w:rPr>
-      <w:t xml:space="preserve"> {% if tool_ID == “divorce_complaint</w:t>
+      <w:t>{% if tool_ID == “divorce_complaint</w:t>
     </w:r>
     <w:r>
       <w:rPr>
@@ -2854,7 +2977,25 @@
         <w:sz w:val="20"/>
         <w:szCs w:val="20"/>
       </w:rPr>
-      <w:t xml:space="preserve">{% elif tool_ID == “divorce_answer” </w:t>
+      <w:t>{% elif tool_ID == “</w:t>
+    </w:r>
+    <w:proofErr w:type="spellStart"/>
+    <w:r>
+      <w:rPr>
+        <w:rFonts w:ascii="Arial" w:hAnsi="Arial" w:cs="Arial"/>
+        <w:sz w:val="20"/>
+        <w:szCs w:val="20"/>
+      </w:rPr>
+      <w:t>divorce_answer</w:t>
+    </w:r>
+    <w:proofErr w:type="spellEnd"/>
+    <w:r>
+      <w:rPr>
+        <w:rFonts w:ascii="Arial" w:hAnsi="Arial" w:cs="Arial"/>
+        <w:sz w:val="20"/>
+        <w:szCs w:val="20"/>
+      </w:rPr>
+      <w:t xml:space="preserve">” </w:t>
     </w:r>
     <w:proofErr w:type="gramStart"/>
     <w:r>
@@ -2863,15 +3004,15 @@
         <w:sz w:val="20"/>
         <w:szCs w:val="20"/>
       </w:rPr>
-      <w:t>%}A</w:t>
-    </w:r>
-    <w:r>
-      <w:rPr>
-        <w:rFonts w:ascii="Arial" w:hAnsi="Arial" w:cs="Arial"/>
-        <w:sz w:val="20"/>
-        <w:szCs w:val="20"/>
-      </w:rPr>
-      <w:t>nswer</w:t>
+      <w:t>%}</w:t>
+    </w:r>
+    <w:r>
+      <w:rPr>
+        <w:rFonts w:ascii="Arial" w:hAnsi="Arial" w:cs="Arial"/>
+        <w:sz w:val="20"/>
+        <w:szCs w:val="20"/>
+      </w:rPr>
+      <w:t>Counterclaim</w:t>
     </w:r>
     <w:proofErr w:type="gramEnd"/>
     <w:r>
@@ -2881,6 +3022,14 @@
         <w:szCs w:val="20"/>
       </w:rPr>
       <w:t>{% endif %}</w:t>
+    </w:r>
+    <w:r>
+      <w:rPr>
+        <w:rFonts w:ascii="Arial" w:hAnsi="Arial" w:cs="Arial"/>
+        <w:sz w:val="20"/>
+        <w:szCs w:val="20"/>
+      </w:rPr>
+      <w:t xml:space="preserve"> for Divorce</w:t>
     </w:r>
   </w:p>
   <w:p>
@@ -3253,15 +3402,6 @@
           </w:pPr>
           <w:r>
             <w:rPr>
-              <w:b/>
-              <w:bCs/>
-              <w:sz w:val="20"/>
-              <w:szCs w:val="20"/>
-            </w:rPr>
-            <w:t xml:space="preserve">DIVORCE </w:t>
-          </w:r>
-          <w:r>
-            <w:rPr>
               <w:sz w:val="20"/>
               <w:szCs w:val="20"/>
             </w:rPr>
@@ -3307,7 +3447,7 @@
               <w:sz w:val="20"/>
               <w:szCs w:val="20"/>
             </w:rPr>
-            <w:t>ANSWER</w:t>
+            <w:t>COUNTERCLAIM</w:t>
           </w:r>
           <w:proofErr w:type="gramEnd"/>
           <w:r>
@@ -3316,6 +3456,22 @@
               <w:szCs w:val="20"/>
             </w:rPr>
             <w:t>{% endif %}</w:t>
+          </w:r>
+          <w:r>
+            <w:rPr>
+              <w:sz w:val="20"/>
+              <w:szCs w:val="20"/>
+            </w:rPr>
+            <w:t xml:space="preserve"> </w:t>
+          </w:r>
+          <w:r>
+            <w:rPr>
+              <w:b/>
+              <w:bCs/>
+              <w:sz w:val="20"/>
+              <w:szCs w:val="20"/>
+            </w:rPr>
+            <w:t>FOR DIVORCE</w:t>
           </w:r>
         </w:p>
       </w:tc>

</xml_diff>

<commit_message>
more refining of CC logic
</commit_message>
<xml_diff>
--- a/docassemble/MLHDivorceAndCustody/data/templates/complaint_answer_attachment.docx
+++ b/docassemble/MLHDivorceAndCustody/data/templates/complaint_answer_attachment.docx
@@ -96,7 +96,13 @@
         <w:rPr>
           <w:rFonts w:ascii="Arial" w:hAnsi="Arial" w:cs="Arial"/>
         </w:rPr>
-        <w:t>complaint_type</w:t>
+        <w:t>counterclaim</w:t>
+      </w:r>
+      <w:r>
+        <w:rPr>
+          <w:rFonts w:ascii="Arial" w:hAnsi="Arial" w:cs="Arial"/>
+        </w:rPr>
+        <w:t>_type</w:t>
       </w:r>
       <w:proofErr w:type="spellEnd"/>
       <w:r>
@@ -117,7 +123,27 @@
         <w:rPr>
           <w:rFonts w:ascii="Arial" w:hAnsi="Arial" w:cs="Arial"/>
         </w:rPr>
-        <w:t xml:space="preserve">”)) and </w:t>
+        <w:t>”</w:t>
+      </w:r>
+      <w:r>
+        <w:rPr>
+          <w:rFonts w:ascii="Arial" w:hAnsi="Arial" w:cs="Arial"/>
+        </w:rPr>
+        <w:t xml:space="preserve"> and </w:t>
+      </w:r>
+      <w:proofErr w:type="spellStart"/>
+      <w:r>
+        <w:rPr>
+          <w:rFonts w:ascii="Arial" w:hAnsi="Arial" w:cs="Arial"/>
+        </w:rPr>
+        <w:t>counterclaim_includes_custody_info</w:t>
+      </w:r>
+      <w:proofErr w:type="spellEnd"/>
+      <w:r>
+        <w:rPr>
+          <w:rFonts w:ascii="Arial" w:hAnsi="Arial" w:cs="Arial"/>
+        </w:rPr>
+        <w:t xml:space="preserve">)) and </w:t>
       </w:r>
       <w:proofErr w:type="spellStart"/>
       <w:r>
@@ -274,16 +300,8 @@
         <w:rPr>
           <w:rFonts w:ascii="Arial" w:hAnsi="Arial" w:cs="Arial"/>
         </w:rPr>
-        <w:t xml:space="preserve">{%p </w:t>
-      </w:r>
-      <w:proofErr w:type="gramStart"/>
-      <w:r>
-        <w:rPr>
-          <w:rFonts w:ascii="Arial" w:hAnsi="Arial" w:cs="Arial"/>
-        </w:rPr>
-        <w:t>endif %}</w:t>
-      </w:r>
-      <w:proofErr w:type="gramEnd"/>
+        <w:t>{%p endif %}</w:t>
+      </w:r>
     </w:p>
     <w:p>
       <w:pPr>
@@ -362,7 +380,89 @@
           <w:rFonts w:ascii="Arial" w:hAnsi="Arial" w:cs="Arial"/>
           <w:highlight w:val="yellow"/>
         </w:rPr>
-        <w:t xml:space="preserve"> %}</w:t>
+        <w:t xml:space="preserve"> </w:t>
+      </w:r>
+      <w:r>
+        <w:rPr>
+          <w:rFonts w:ascii="Arial" w:hAnsi="Arial" w:cs="Arial"/>
+          <w:highlight w:val="yellow"/>
+        </w:rPr>
+        <w:t xml:space="preserve">or </w:t>
+      </w:r>
+      <w:r>
+        <w:rPr>
+          <w:rFonts w:ascii="Arial" w:hAnsi="Arial" w:cs="Arial"/>
+        </w:rPr>
+        <w:t>(</w:t>
+      </w:r>
+      <w:proofErr w:type="spellStart"/>
+      <w:r>
+        <w:rPr>
+          <w:rFonts w:ascii="Arial" w:hAnsi="Arial" w:cs="Arial"/>
+        </w:rPr>
+        <w:t>tool_ID</w:t>
+      </w:r>
+      <w:proofErr w:type="spellEnd"/>
+      <w:r>
+        <w:rPr>
+          <w:rFonts w:ascii="Arial" w:hAnsi="Arial" w:cs="Arial"/>
+        </w:rPr>
+        <w:t xml:space="preserve"> == “</w:t>
+      </w:r>
+      <w:proofErr w:type="spellStart"/>
+      <w:r>
+        <w:rPr>
+          <w:rFonts w:ascii="Arial" w:hAnsi="Arial" w:cs="Arial"/>
+        </w:rPr>
+        <w:t>divorce_answer</w:t>
+      </w:r>
+      <w:proofErr w:type="spellEnd"/>
+      <w:r>
+        <w:rPr>
+          <w:rFonts w:ascii="Arial" w:hAnsi="Arial" w:cs="Arial"/>
+        </w:rPr>
+        <w:t xml:space="preserve">” and </w:t>
+      </w:r>
+      <w:proofErr w:type="spellStart"/>
+      <w:r>
+        <w:rPr>
+          <w:rFonts w:ascii="Arial" w:hAnsi="Arial" w:cs="Arial"/>
+        </w:rPr>
+        <w:t>counterclaim_type</w:t>
+      </w:r>
+      <w:proofErr w:type="spellEnd"/>
+      <w:r>
+        <w:rPr>
+          <w:rFonts w:ascii="Arial" w:hAnsi="Arial" w:cs="Arial"/>
+        </w:rPr>
+        <w:t xml:space="preserve"> == “</w:t>
+      </w:r>
+      <w:proofErr w:type="spellStart"/>
+      <w:r>
+        <w:rPr>
+          <w:rFonts w:ascii="Arial" w:hAnsi="Arial" w:cs="Arial"/>
+        </w:rPr>
+        <w:t>with_children</w:t>
+      </w:r>
+      <w:proofErr w:type="spellEnd"/>
+      <w:r>
+        <w:rPr>
+          <w:rFonts w:ascii="Arial" w:hAnsi="Arial" w:cs="Arial"/>
+        </w:rPr>
+        <w:t>”</w:t>
+      </w:r>
+      <w:r>
+        <w:rPr>
+          <w:rFonts w:ascii="Arial" w:hAnsi="Arial" w:cs="Arial"/>
+        </w:rPr>
+        <w:t xml:space="preserve">) </w:t>
+      </w:r>
+      <w:r>
+        <w:rPr>
+          <w:rFonts w:ascii="Arial" w:hAnsi="Arial" w:cs="Arial"/>
+          <w:highlight w:val="yellow"/>
+        </w:rPr>
+        <w:t>%}</w:t>
       </w:r>
       <w:r>
         <w:rPr>
@@ -1187,21 +1287,6 @@
           <w:rFonts w:ascii="Arial" w:hAnsi="Arial" w:cs="Arial"/>
           <w:highlight w:val="cyan"/>
         </w:rPr>
-        <w:t>{%p endif %}</w:t>
-      </w:r>
-    </w:p>
-    <w:p>
-      <w:pPr>
-        <w:spacing w:after="0" w:line="240" w:lineRule="auto"/>
-        <w:rPr>
-          <w:rFonts w:ascii="Arial" w:hAnsi="Arial" w:cs="Arial"/>
-        </w:rPr>
-      </w:pPr>
-      <w:r>
-        <w:rPr>
-          <w:rFonts w:ascii="Arial" w:hAnsi="Arial" w:cs="Arial"/>
-          <w:highlight w:val="yellow"/>
-        </w:rPr>
         <w:lastRenderedPageBreak/>
         <w:t>{%p endif %}</w:t>
       </w:r>
@@ -1213,6 +1298,21 @@
           <w:rFonts w:ascii="Arial" w:hAnsi="Arial" w:cs="Arial"/>
         </w:rPr>
       </w:pPr>
+      <w:r>
+        <w:rPr>
+          <w:rFonts w:ascii="Arial" w:hAnsi="Arial" w:cs="Arial"/>
+          <w:highlight w:val="yellow"/>
+        </w:rPr>
+        <w:t>{%p endif %}</w:t>
+      </w:r>
+    </w:p>
+    <w:p>
+      <w:pPr>
+        <w:spacing w:after="0" w:line="240" w:lineRule="auto"/>
+        <w:rPr>
+          <w:rFonts w:ascii="Arial" w:hAnsi="Arial" w:cs="Arial"/>
+        </w:rPr>
+      </w:pPr>
     </w:p>
     <w:p>
       <w:pPr>
@@ -2236,7 +2336,6 @@
           <w:rFonts w:ascii="Arial" w:hAnsi="Arial" w:cs="Arial"/>
         </w:rPr>
       </w:pPr>
-      <w:proofErr w:type="gramStart"/>
       <w:r>
         <w:rPr>
           <w:rFonts w:ascii="Arial" w:hAnsi="Arial" w:cs="Arial"/>
@@ -2248,35 +2347,14 @@
         <w:rPr>
           <w:rFonts w:ascii="Arial" w:hAnsi="Arial" w:cs="Arial"/>
         </w:rPr>
-        <w:t>ss</w:t>
-      </w:r>
-      <w:proofErr w:type="gramEnd"/>
-      <w:r>
-        <w:rPr>
-          <w:rFonts w:ascii="Arial" w:hAnsi="Arial" w:cs="Arial"/>
-        </w:rPr>
-        <w:t>_factor_twelve_fault_</w:t>
-      </w:r>
-      <w:proofErr w:type="gramStart"/>
-      <w:r>
-        <w:rPr>
-          <w:rFonts w:ascii="Arial" w:hAnsi="Arial" w:cs="Arial"/>
-        </w:rPr>
-        <w:t>redux</w:t>
-      </w:r>
-      <w:proofErr w:type="spellEnd"/>
-      <w:r>
-        <w:rPr>
-          <w:rFonts w:ascii="Arial" w:hAnsi="Arial" w:cs="Arial"/>
-        </w:rPr>
-        <w:t xml:space="preserve"> }</w:t>
-      </w:r>
-      <w:proofErr w:type="gramEnd"/>
-      <w:r>
-        <w:rPr>
-          <w:rFonts w:ascii="Arial" w:hAnsi="Arial" w:cs="Arial"/>
-        </w:rPr>
-        <w:t>}</w:t>
+        <w:t>ss_factor_twelve_fault_redux</w:t>
+      </w:r>
+      <w:proofErr w:type="spellEnd"/>
+      <w:r>
+        <w:rPr>
+          <w:rFonts w:ascii="Arial" w:hAnsi="Arial" w:cs="Arial"/>
+        </w:rPr>
+        <w:t xml:space="preserve"> }}</w:t>
       </w:r>
     </w:p>
     <w:p>
@@ -2493,39 +2571,22 @@
           <w:rFonts w:ascii="Arial" w:hAnsi="Arial" w:cs="Arial"/>
           <w:highlight w:val="yellow"/>
         </w:rPr>
-        <w:t xml:space="preserve">{%p </w:t>
-      </w:r>
-      <w:proofErr w:type="gramStart"/>
-      <w:r>
-        <w:rPr>
-          <w:rFonts w:ascii="Arial" w:hAnsi="Arial" w:cs="Arial"/>
-          <w:highlight w:val="yellow"/>
-        </w:rPr>
-        <w:t>endif %}</w:t>
-      </w:r>
-      <w:proofErr w:type="gramEnd"/>
-    </w:p>
-    <w:p>
-      <w:pPr>
-        <w:spacing w:after="0" w:line="240" w:lineRule="auto"/>
-        <w:rPr>
-          <w:rFonts w:ascii="Arial" w:hAnsi="Arial" w:cs="Arial"/>
-        </w:rPr>
-      </w:pPr>
-      <w:r>
-        <w:rPr>
-          <w:rFonts w:ascii="Arial" w:hAnsi="Arial" w:cs="Arial"/>
-        </w:rPr>
-        <w:t xml:space="preserve">{%p </w:t>
-      </w:r>
-      <w:proofErr w:type="gramStart"/>
-      <w:r>
-        <w:rPr>
-          <w:rFonts w:ascii="Arial" w:hAnsi="Arial" w:cs="Arial"/>
-        </w:rPr>
-        <w:t>endif %}</w:t>
-      </w:r>
-      <w:proofErr w:type="gramEnd"/>
+        <w:t>{%p endif %}</w:t>
+      </w:r>
+    </w:p>
+    <w:p>
+      <w:pPr>
+        <w:spacing w:after="0" w:line="240" w:lineRule="auto"/>
+        <w:rPr>
+          <w:rFonts w:ascii="Arial" w:hAnsi="Arial" w:cs="Arial"/>
+        </w:rPr>
+      </w:pPr>
+      <w:r>
+        <w:rPr>
+          <w:rFonts w:ascii="Arial" w:hAnsi="Arial" w:cs="Arial"/>
+        </w:rPr>
+        <w:t>{%p endif %}</w:t>
+      </w:r>
     </w:p>
     <w:sectPr>
       <w:footerReference w:type="default" r:id="rId7"/>
@@ -2683,34 +2744,42 @@
         <w:sz w:val="20"/>
         <w:szCs w:val="20"/>
       </w:rPr>
+      <w:t xml:space="preserve"> %}C</w:t>
+    </w:r>
+    <w:r>
+      <w:rPr>
+        <w:rFonts w:ascii="Arial" w:hAnsi="Arial" w:cs="Arial"/>
+        <w:sz w:val="20"/>
+        <w:szCs w:val="20"/>
+      </w:rPr>
+      <w:t>omplaint</w:t>
+    </w:r>
+    <w:r>
+      <w:rPr>
+        <w:rFonts w:ascii="Arial" w:hAnsi="Arial" w:cs="Arial"/>
+        <w:sz w:val="20"/>
+        <w:szCs w:val="20"/>
+      </w:rPr>
+      <w:t xml:space="preserve">{% </w:t>
+    </w:r>
+    <w:proofErr w:type="spellStart"/>
+    <w:r>
+      <w:rPr>
+        <w:rFonts w:ascii="Arial" w:hAnsi="Arial" w:cs="Arial"/>
+        <w:sz w:val="20"/>
+        <w:szCs w:val="20"/>
+      </w:rPr>
+      <w:t>elif</w:t>
+    </w:r>
+    <w:proofErr w:type="spellEnd"/>
+    <w:r>
+      <w:rPr>
+        <w:rFonts w:ascii="Arial" w:hAnsi="Arial" w:cs="Arial"/>
+        <w:sz w:val="20"/>
+        <w:szCs w:val="20"/>
+      </w:rPr>
       <w:t xml:space="preserve"> </w:t>
     </w:r>
-    <w:proofErr w:type="gramStart"/>
-    <w:r>
-      <w:rPr>
-        <w:rFonts w:ascii="Arial" w:hAnsi="Arial" w:cs="Arial"/>
-        <w:sz w:val="20"/>
-        <w:szCs w:val="20"/>
-      </w:rPr>
-      <w:t>%}C</w:t>
-    </w:r>
-    <w:r>
-      <w:rPr>
-        <w:rFonts w:ascii="Arial" w:hAnsi="Arial" w:cs="Arial"/>
-        <w:sz w:val="20"/>
-        <w:szCs w:val="20"/>
-      </w:rPr>
-      <w:t>omplaint</w:t>
-    </w:r>
-    <w:proofErr w:type="gramEnd"/>
-    <w:r>
-      <w:rPr>
-        <w:rFonts w:ascii="Arial" w:hAnsi="Arial" w:cs="Arial"/>
-        <w:sz w:val="20"/>
-        <w:szCs w:val="20"/>
-      </w:rPr>
-      <w:t xml:space="preserve">{% </w:t>
-    </w:r>
     <w:proofErr w:type="spellStart"/>
     <w:r>
       <w:rPr>
@@ -2718,7 +2787,7 @@
         <w:sz w:val="20"/>
         <w:szCs w:val="20"/>
       </w:rPr>
-      <w:t>elif</w:t>
+      <w:t>tool_ID</w:t>
     </w:r>
     <w:proofErr w:type="spellEnd"/>
     <w:r>
@@ -2727,7 +2796,7 @@
         <w:sz w:val="20"/>
         <w:szCs w:val="20"/>
       </w:rPr>
-      <w:t xml:space="preserve"> </w:t>
+      <w:t xml:space="preserve"> == “</w:t>
     </w:r>
     <w:proofErr w:type="spellStart"/>
     <w:r>
@@ -2736,7 +2805,7 @@
         <w:sz w:val="20"/>
         <w:szCs w:val="20"/>
       </w:rPr>
-      <w:t>tool_ID</w:t>
+      <w:t>divorce_answer</w:t>
     </w:r>
     <w:proofErr w:type="spellEnd"/>
     <w:r>
@@ -2745,34 +2814,7 @@
         <w:sz w:val="20"/>
         <w:szCs w:val="20"/>
       </w:rPr>
-      <w:t xml:space="preserve"> == “</w:t>
-    </w:r>
-    <w:proofErr w:type="spellStart"/>
-    <w:r>
-      <w:rPr>
-        <w:rFonts w:ascii="Arial" w:hAnsi="Arial" w:cs="Arial"/>
-        <w:sz w:val="20"/>
-        <w:szCs w:val="20"/>
-      </w:rPr>
-      <w:t>divorce_answer</w:t>
-    </w:r>
-    <w:proofErr w:type="spellEnd"/>
-    <w:r>
-      <w:rPr>
-        <w:rFonts w:ascii="Arial" w:hAnsi="Arial" w:cs="Arial"/>
-        <w:sz w:val="20"/>
-        <w:szCs w:val="20"/>
-      </w:rPr>
-      <w:t xml:space="preserve">” </w:t>
-    </w:r>
-    <w:proofErr w:type="gramStart"/>
-    <w:r>
-      <w:rPr>
-        <w:rFonts w:ascii="Arial" w:hAnsi="Arial" w:cs="Arial"/>
-        <w:sz w:val="20"/>
-        <w:szCs w:val="20"/>
-      </w:rPr>
-      <w:t>%}</w:t>
+      <w:t>” %}</w:t>
     </w:r>
     <w:r>
       <w:rPr>
@@ -2782,7 +2824,6 @@
       </w:rPr>
       <w:t>Counterclaim</w:t>
     </w:r>
-    <w:proofErr w:type="gramEnd"/>
     <w:r>
       <w:rPr>
         <w:rFonts w:ascii="Arial" w:hAnsi="Arial" w:cs="Arial"/>
@@ -2951,34 +2992,42 @@
         <w:sz w:val="20"/>
         <w:szCs w:val="20"/>
       </w:rPr>
+      <w:t xml:space="preserve"> %}</w:t>
+    </w:r>
+    <w:r>
+      <w:rPr>
+        <w:rFonts w:ascii="Arial" w:hAnsi="Arial" w:cs="Arial"/>
+        <w:sz w:val="20"/>
+        <w:szCs w:val="20"/>
+      </w:rPr>
+      <w:t>Complaint</w:t>
+    </w:r>
+    <w:r>
+      <w:rPr>
+        <w:rFonts w:ascii="Arial" w:hAnsi="Arial" w:cs="Arial"/>
+        <w:sz w:val="20"/>
+        <w:szCs w:val="20"/>
+      </w:rPr>
+      <w:t xml:space="preserve">{% </w:t>
+    </w:r>
+    <w:proofErr w:type="spellStart"/>
+    <w:r>
+      <w:rPr>
+        <w:rFonts w:ascii="Arial" w:hAnsi="Arial" w:cs="Arial"/>
+        <w:sz w:val="20"/>
+        <w:szCs w:val="20"/>
+      </w:rPr>
+      <w:t>elif</w:t>
+    </w:r>
+    <w:proofErr w:type="spellEnd"/>
+    <w:r>
+      <w:rPr>
+        <w:rFonts w:ascii="Arial" w:hAnsi="Arial" w:cs="Arial"/>
+        <w:sz w:val="20"/>
+        <w:szCs w:val="20"/>
+      </w:rPr>
       <w:t xml:space="preserve"> </w:t>
     </w:r>
-    <w:proofErr w:type="gramStart"/>
-    <w:r>
-      <w:rPr>
-        <w:rFonts w:ascii="Arial" w:hAnsi="Arial" w:cs="Arial"/>
-        <w:sz w:val="20"/>
-        <w:szCs w:val="20"/>
-      </w:rPr>
-      <w:t>%}</w:t>
-    </w:r>
-    <w:r>
-      <w:rPr>
-        <w:rFonts w:ascii="Arial" w:hAnsi="Arial" w:cs="Arial"/>
-        <w:sz w:val="20"/>
-        <w:szCs w:val="20"/>
-      </w:rPr>
-      <w:t>Complaint</w:t>
-    </w:r>
-    <w:proofErr w:type="gramEnd"/>
-    <w:r>
-      <w:rPr>
-        <w:rFonts w:ascii="Arial" w:hAnsi="Arial" w:cs="Arial"/>
-        <w:sz w:val="20"/>
-        <w:szCs w:val="20"/>
-      </w:rPr>
-      <w:t>{% elif tool_ID == “</w:t>
-    </w:r>
     <w:proofErr w:type="spellStart"/>
     <w:r>
       <w:rPr>
@@ -2986,6 +3035,24 @@
         <w:sz w:val="20"/>
         <w:szCs w:val="20"/>
       </w:rPr>
+      <w:t>tool_ID</w:t>
+    </w:r>
+    <w:proofErr w:type="spellEnd"/>
+    <w:r>
+      <w:rPr>
+        <w:rFonts w:ascii="Arial" w:hAnsi="Arial" w:cs="Arial"/>
+        <w:sz w:val="20"/>
+        <w:szCs w:val="20"/>
+      </w:rPr>
+      <w:t xml:space="preserve"> == “</w:t>
+    </w:r>
+    <w:proofErr w:type="spellStart"/>
+    <w:r>
+      <w:rPr>
+        <w:rFonts w:ascii="Arial" w:hAnsi="Arial" w:cs="Arial"/>
+        <w:sz w:val="20"/>
+        <w:szCs w:val="20"/>
+      </w:rPr>
       <w:t>divorce_answer</w:t>
     </w:r>
     <w:proofErr w:type="spellEnd"/>
@@ -2995,16 +3062,7 @@
         <w:sz w:val="20"/>
         <w:szCs w:val="20"/>
       </w:rPr>
-      <w:t xml:space="preserve">” </w:t>
-    </w:r>
-    <w:proofErr w:type="gramStart"/>
-    <w:r>
-      <w:rPr>
-        <w:rFonts w:ascii="Arial" w:hAnsi="Arial" w:cs="Arial"/>
-        <w:sz w:val="20"/>
-        <w:szCs w:val="20"/>
-      </w:rPr>
-      <w:t>%}</w:t>
+      <w:t>” %}</w:t>
     </w:r>
     <w:r>
       <w:rPr>
@@ -3014,7 +3072,6 @@
       </w:rPr>
       <w:t>Counterclaim</w:t>
     </w:r>
-    <w:proofErr w:type="gramEnd"/>
     <w:r>
       <w:rPr>
         <w:rFonts w:ascii="Arial" w:hAnsi="Arial" w:cs="Arial"/>
@@ -3182,7 +3239,6 @@
               <w:szCs w:val="20"/>
             </w:rPr>
           </w:pPr>
-          <w:proofErr w:type="gramStart"/>
           <w:r>
             <w:rPr>
               <w:b/>
@@ -3201,30 +3257,9 @@
               <w:sz w:val="20"/>
               <w:szCs w:val="20"/>
             </w:rPr>
-            <w:t>the</w:t>
-          </w:r>
-          <w:proofErr w:type="gramEnd"/>
-          <w:r>
-            <w:rPr>
-              <w:b/>
-              <w:bCs/>
-              <w:sz w:val="20"/>
-              <w:szCs w:val="20"/>
-            </w:rPr>
-            <w:t>_</w:t>
-          </w:r>
-          <w:proofErr w:type="gramStart"/>
-          <w:r>
-            <w:rPr>
-              <w:b/>
-              <w:bCs/>
-              <w:sz w:val="20"/>
-              <w:szCs w:val="20"/>
-            </w:rPr>
-            <w:t>court.number</w:t>
+            <w:t>the_court.number</w:t>
           </w:r>
           <w:proofErr w:type="spellEnd"/>
-          <w:proofErr w:type="gramEnd"/>
           <w:r>
             <w:rPr>
               <w:b/>
@@ -3256,7 +3291,6 @@
               <w:szCs w:val="20"/>
             </w:rPr>
           </w:pPr>
-          <w:proofErr w:type="gramStart"/>
           <w:r>
             <w:rPr>
               <w:b/>
@@ -3275,9 +3309,9 @@
               <w:sz w:val="20"/>
               <w:szCs w:val="20"/>
             </w:rPr>
-            <w:t>county</w:t>
+            <w:t>county_choice.upper</w:t>
           </w:r>
-          <w:proofErr w:type="gramEnd"/>
+          <w:proofErr w:type="spellEnd"/>
           <w:r>
             <w:rPr>
               <w:b/>
@@ -3285,38 +3319,7 @@
               <w:sz w:val="20"/>
               <w:szCs w:val="20"/>
             </w:rPr>
-            <w:t>_</w:t>
-          </w:r>
-          <w:proofErr w:type="gramStart"/>
-          <w:r>
-            <w:rPr>
-              <w:b/>
-              <w:bCs/>
-              <w:sz w:val="20"/>
-              <w:szCs w:val="20"/>
-            </w:rPr>
-            <w:t>choice.upper</w:t>
-          </w:r>
-          <w:proofErr w:type="spellEnd"/>
-          <w:proofErr w:type="gramEnd"/>
-          <w:r>
-            <w:rPr>
-              <w:b/>
-              <w:bCs/>
-              <w:sz w:val="20"/>
-              <w:szCs w:val="20"/>
-            </w:rPr>
-            <w:t>(</w:t>
-          </w:r>
-          <w:proofErr w:type="gramStart"/>
-          <w:r>
-            <w:rPr>
-              <w:b/>
-              <w:bCs/>
-              <w:sz w:val="20"/>
-              <w:szCs w:val="20"/>
-            </w:rPr>
-            <w:t>)</w:t>
+            <w:t>()</w:t>
           </w:r>
           <w:r>
             <w:rPr>
@@ -3326,18 +3329,7 @@
               <w:sz w:val="20"/>
               <w:szCs w:val="20"/>
             </w:rPr>
-            <w:t xml:space="preserve"> }</w:t>
-          </w:r>
-          <w:proofErr w:type="gramEnd"/>
-          <w:r>
-            <w:rPr>
-              <w:b/>
-              <w:bCs/>
-              <w:caps/>
-              <w:sz w:val="20"/>
-              <w:szCs w:val="20"/>
-            </w:rPr>
-            <w:t xml:space="preserve">} </w:t>
+            <w:t xml:space="preserve"> }} </w:t>
           </w:r>
           <w:r>
             <w:rPr>
@@ -3405,15 +3397,7 @@
               <w:sz w:val="20"/>
               <w:szCs w:val="20"/>
             </w:rPr>
-            <w:t xml:space="preserve">{% if tool_ID == “divorce_complaint” </w:t>
-          </w:r>
-          <w:proofErr w:type="gramStart"/>
-          <w:r>
-            <w:rPr>
-              <w:sz w:val="20"/>
-              <w:szCs w:val="20"/>
-            </w:rPr>
-            <w:t>%}</w:t>
+            <w:t>{% if tool_ID == “divorce_complaint” %}</w:t>
           </w:r>
           <w:r>
             <w:rPr>
@@ -3424,21 +3408,12 @@
             </w:rPr>
             <w:t>COMPLAINT</w:t>
           </w:r>
-          <w:proofErr w:type="gramEnd"/>
           <w:r>
             <w:rPr>
               <w:sz w:val="20"/>
               <w:szCs w:val="20"/>
             </w:rPr>
-            <w:t xml:space="preserve">{% elif tool_ID == “divorce_answer” </w:t>
-          </w:r>
-          <w:proofErr w:type="gramStart"/>
-          <w:r>
-            <w:rPr>
-              <w:sz w:val="20"/>
-              <w:szCs w:val="20"/>
-            </w:rPr>
-            <w:t>%}</w:t>
+            <w:t>{% elif tool_ID == “divorce_answer” %}</w:t>
           </w:r>
           <w:r>
             <w:rPr>
@@ -3449,7 +3424,6 @@
             </w:rPr>
             <w:t>COUNTERCLAIM</w:t>
           </w:r>
-          <w:proofErr w:type="gramEnd"/>
           <w:r>
             <w:rPr>
               <w:sz w:val="20"/>
@@ -3517,7 +3491,6 @@
               <w:szCs w:val="20"/>
             </w:rPr>
           </w:pPr>
-          <w:proofErr w:type="gramStart"/>
           <w:r>
             <w:rPr>
               <w:b/>
@@ -3535,17 +3508,7 @@
               <w:sz w:val="20"/>
               <w:szCs w:val="20"/>
             </w:rPr>
-            <w:t>docket</w:t>
-          </w:r>
-          <w:proofErr w:type="gramEnd"/>
-          <w:r>
-            <w:rPr>
-              <w:b/>
-              <w:bCs/>
-              <w:sz w:val="20"/>
-              <w:szCs w:val="20"/>
-            </w:rPr>
-            <w:t>_number</w:t>
+            <w:t>docket_number</w:t>
           </w:r>
           <w:proofErr w:type="spellEnd"/>
           <w:r>

</xml_diff>